<commit_message>
HR Management System - Initial Commit Refactored Files and Added New Files for HR Management System Application
</commit_message>
<xml_diff>
--- a/Sample Data/Migrate Access to New system.docx
+++ b/Sample Data/Migrate Access to New system.docx
@@ -58,7 +58,7 @@
     <w:p>
       <w:r>
         <w:pict w14:anchorId="16D3F39E">
-          <v:rect id="_x0000_i1085" style="width:0;height:1.5pt" o:hralign="center" o:hrstd="t" o:hr="t" fillcolor="#a0a0a0" stroked="f"/>
+          <v:rect id="_x0000_i1025" style="width:0;height:1.5pt" o:hralign="center" o:hrstd="t" o:hr="t" fillcolor="#a0a0a0" stroked="f"/>
         </w:pict>
       </w:r>
     </w:p>
@@ -150,7 +150,7 @@
     <w:p>
       <w:r>
         <w:pict w14:anchorId="5C35B091">
-          <v:rect id="_x0000_i1086" style="width:0;height:1.5pt" o:hralign="center" o:hrstd="t" o:hr="t" fillcolor="#a0a0a0" stroked="f"/>
+          <v:rect id="_x0000_i1026" style="width:0;height:1.5pt" o:hralign="center" o:hrstd="t" o:hr="t" fillcolor="#a0a0a0" stroked="f"/>
         </w:pict>
       </w:r>
     </w:p>
@@ -302,29 +302,13 @@
     </w:p>
     <w:p>
       <w:r>
-        <w:t xml:space="preserve">    name </w:t>
-      </w:r>
-      <w:proofErr w:type="gramStart"/>
-      <w:r>
-        <w:t>VARCHAR(</w:t>
-      </w:r>
-      <w:proofErr w:type="gramEnd"/>
-      <w:r>
-        <w:t>255) NOT NULL,</w:t>
+        <w:t xml:space="preserve">    name VARCHAR(255) NOT NULL,</w:t>
       </w:r>
     </w:p>
     <w:p>
       <w:r>
         <w:lastRenderedPageBreak/>
-        <w:t xml:space="preserve">    email </w:t>
-      </w:r>
-      <w:proofErr w:type="gramStart"/>
-      <w:r>
-        <w:t>VARCHAR(</w:t>
-      </w:r>
-      <w:proofErr w:type="gramEnd"/>
-      <w:r>
-        <w:t>255) UNIQUE,</w:t>
+        <w:t xml:space="preserve">    email VARCHAR(255) UNIQUE,</w:t>
       </w:r>
     </w:p>
     <w:p>
@@ -341,16 +325,14 @@
       </w:r>
     </w:p>
     <w:p>
-      <w:proofErr w:type="gramStart"/>
       <w:r>
         <w:t>);</w:t>
       </w:r>
-      <w:proofErr w:type="gramEnd"/>
     </w:p>
     <w:p>
       <w:r>
         <w:pict w14:anchorId="12C37F0C">
-          <v:rect id="_x0000_i1087" style="width:0;height:1.5pt" o:hralign="center" o:hrstd="t" o:hr="t" fillcolor="#a0a0a0" stroked="f"/>
+          <v:rect id="_x0000_i1027" style="width:0;height:1.5pt" o:hralign="center" o:hrstd="t" o:hr="t" fillcolor="#a0a0a0" stroked="f"/>
         </w:pict>
       </w:r>
     </w:p>
@@ -415,12 +397,10 @@
         <w:t xml:space="preserve"> = </w:t>
       </w:r>
       <w:proofErr w:type="spellStart"/>
-      <w:proofErr w:type="gramStart"/>
       <w:r>
         <w:t>pyodbc.connect</w:t>
       </w:r>
       <w:proofErr w:type="spellEnd"/>
-      <w:proofErr w:type="gramEnd"/>
       <w:r>
         <w:t>(</w:t>
       </w:r>
@@ -434,13 +414,8 @@
         <w:t>r"DRIVER</w:t>
       </w:r>
       <w:proofErr w:type="spellEnd"/>
-      <w:proofErr w:type="gramStart"/>
-      <w:r>
-        <w:t>={</w:t>
-      </w:r>
-      <w:proofErr w:type="gramEnd"/>
-      <w:r>
-        <w:t>Microsoft Access Driver (*.</w:t>
+      <w:r>
+        <w:t>={Microsoft Access Driver (*.</w:t>
       </w:r>
       <w:proofErr w:type="spellStart"/>
       <w:r>
@@ -488,141 +463,182 @@
         <w:t xml:space="preserve"> = </w:t>
       </w:r>
       <w:proofErr w:type="spellStart"/>
-      <w:proofErr w:type="gramStart"/>
-      <w:r>
-        <w:t>pd.read</w:t>
-      </w:r>
-      <w:proofErr w:type="gramEnd"/>
-      <w:r>
-        <w:t>_</w:t>
-      </w:r>
-      <w:proofErr w:type="gramStart"/>
-      <w:r>
-        <w:t>sql</w:t>
+      <w:r>
+        <w:t>pd.read_sql</w:t>
+      </w:r>
+      <w:proofErr w:type="spellEnd"/>
+      <w:r>
+        <w:t xml:space="preserve">("SELECT * FROM Customers", </w:t>
+      </w:r>
+      <w:proofErr w:type="spellStart"/>
+      <w:r>
+        <w:t>access_conn</w:t>
+      </w:r>
+      <w:proofErr w:type="spellEnd"/>
+      <w:r>
+        <w:t>)</w:t>
+      </w:r>
+    </w:p>
+    <w:p>
+      <w:r>
+        <w:t>You can loop through tables if needed.</w:t>
+      </w:r>
+    </w:p>
+    <w:p>
+      <w:r>
+        <w:pict w14:anchorId="70EDB710">
+          <v:rect id="_x0000_i1028" style="width:0;height:1.5pt" o:hralign="center" o:hrstd="t" o:hr="t" fillcolor="#a0a0a0" stroked="f"/>
+        </w:pict>
+      </w:r>
+    </w:p>
+    <w:p>
+      <w:pPr>
+        <w:rPr>
+          <w:b/>
+          <w:bCs/>
+        </w:rPr>
+      </w:pPr>
+      <w:r>
+        <w:rPr>
+          <w:b/>
+          <w:bCs/>
+        </w:rPr>
+        <w:t>3. Load data into your SQL database</w:t>
+      </w:r>
+    </w:p>
+    <w:p>
+      <w:pPr>
+        <w:rPr>
+          <w:b/>
+          <w:bCs/>
+        </w:rPr>
+      </w:pPr>
+      <w:r>
+        <w:rPr>
+          <w:b/>
+          <w:bCs/>
+        </w:rPr>
+        <w:t>Connect Python to SQL</w:t>
+      </w:r>
+    </w:p>
+    <w:p>
+      <w:r>
+        <w:t xml:space="preserve">from </w:t>
+      </w:r>
+      <w:proofErr w:type="spellStart"/>
+      <w:r>
+        <w:t>sqlalchemy</w:t>
+      </w:r>
+      <w:proofErr w:type="spellEnd"/>
+      <w:r>
+        <w:t xml:space="preserve"> import </w:t>
+      </w:r>
+      <w:proofErr w:type="spellStart"/>
+      <w:r>
+        <w:t>create_engine</w:t>
+      </w:r>
+      <w:proofErr w:type="spellEnd"/>
+    </w:p>
+    <w:p/>
+    <w:p>
+      <w:r>
+        <w:t xml:space="preserve">engine = </w:t>
+      </w:r>
+      <w:proofErr w:type="spellStart"/>
+      <w:r>
+        <w:t>create_engine</w:t>
       </w:r>
       <w:proofErr w:type="spellEnd"/>
       <w:r>
         <w:t>(</w:t>
       </w:r>
-      <w:proofErr w:type="gramEnd"/>
-      <w:r>
-        <w:t xml:space="preserve">"SELECT * FROM Customers", </w:t>
-      </w:r>
-      <w:proofErr w:type="spellStart"/>
-      <w:r>
-        <w:t>access_conn</w:t>
-      </w:r>
-      <w:proofErr w:type="spellEnd"/>
+    </w:p>
+    <w:p>
+      <w:r>
+        <w:t xml:space="preserve">    "</w:t>
+      </w:r>
+      <w:proofErr w:type="spellStart"/>
+      <w:r>
+        <w:t>mysql+mysqlconnector</w:t>
+      </w:r>
+      <w:proofErr w:type="spellEnd"/>
+      <w:r>
+        <w:t>://</w:t>
+      </w:r>
+      <w:proofErr w:type="spellStart"/>
+      <w:r>
+        <w:t>user:password@localhost</w:t>
+      </w:r>
+      <w:proofErr w:type="spellEnd"/>
+      <w:r>
+        <w:t>/</w:t>
+      </w:r>
+      <w:proofErr w:type="spellStart"/>
+      <w:r>
+        <w:t>new_db</w:t>
+      </w:r>
+      <w:proofErr w:type="spellEnd"/>
+      <w:r>
+        <w:t>"</w:t>
+      </w:r>
+    </w:p>
+    <w:p>
       <w:r>
         <w:t>)</w:t>
       </w:r>
     </w:p>
     <w:p>
-      <w:r>
-        <w:t>You can loop through tables if needed.</w:t>
-      </w:r>
-    </w:p>
-    <w:p>
-      <w:r>
-        <w:pict w14:anchorId="70EDB710">
-          <v:rect id="_x0000_i1088" style="width:0;height:1.5pt" o:hralign="center" o:hrstd="t" o:hr="t" fillcolor="#a0a0a0" stroked="f"/>
-        </w:pict>
-      </w:r>
-    </w:p>
-    <w:p>
-      <w:pPr>
-        <w:rPr>
-          <w:b/>
-          <w:bCs/>
-        </w:rPr>
-      </w:pPr>
-      <w:r>
-        <w:rPr>
-          <w:b/>
-          <w:bCs/>
-        </w:rPr>
-        <w:t>3. Load data into your SQL database</w:t>
-      </w:r>
-    </w:p>
-    <w:p>
-      <w:pPr>
-        <w:rPr>
-          <w:b/>
-          <w:bCs/>
-        </w:rPr>
-      </w:pPr>
-      <w:r>
-        <w:rPr>
-          <w:b/>
-          <w:bCs/>
-        </w:rPr>
-        <w:t>Connect Python to SQL</w:t>
-      </w:r>
-    </w:p>
-    <w:p>
-      <w:r>
-        <w:t xml:space="preserve">from </w:t>
-      </w:r>
-      <w:proofErr w:type="spellStart"/>
-      <w:r>
-        <w:t>sqlalchemy</w:t>
-      </w:r>
-      <w:proofErr w:type="spellEnd"/>
-      <w:r>
-        <w:t xml:space="preserve"> import </w:t>
-      </w:r>
-      <w:proofErr w:type="spellStart"/>
-      <w:r>
-        <w:t>create_engine</w:t>
-      </w:r>
-      <w:proofErr w:type="spellEnd"/>
-    </w:p>
-    <w:p/>
-    <w:p>
-      <w:r>
-        <w:t xml:space="preserve">engine = </w:t>
-      </w:r>
-      <w:proofErr w:type="spellStart"/>
-      <w:r>
-        <w:t>create_</w:t>
-      </w:r>
-      <w:proofErr w:type="gramStart"/>
-      <w:r>
-        <w:t>engine</w:t>
+      <w:pPr>
+        <w:rPr>
+          <w:b/>
+          <w:bCs/>
+        </w:rPr>
+      </w:pPr>
+      <w:r>
+        <w:rPr>
+          <w:b/>
+          <w:bCs/>
+        </w:rPr>
+        <w:t>Insert data</w:t>
+      </w:r>
+    </w:p>
+    <w:p>
+      <w:proofErr w:type="spellStart"/>
+      <w:r>
+        <w:lastRenderedPageBreak/>
+        <w:t>df_customers.to_sql</w:t>
       </w:r>
       <w:proofErr w:type="spellEnd"/>
       <w:r>
         <w:t>(</w:t>
       </w:r>
-      <w:proofErr w:type="gramEnd"/>
-    </w:p>
-    <w:p>
-      <w:r>
-        <w:t xml:space="preserve">    "</w:t>
-      </w:r>
-      <w:proofErr w:type="spellStart"/>
-      <w:r>
-        <w:t>mysql+mysqlconnector</w:t>
-      </w:r>
-      <w:proofErr w:type="spellEnd"/>
-      <w:r>
-        <w:t>://</w:t>
-      </w:r>
-      <w:proofErr w:type="spellStart"/>
-      <w:r>
-        <w:t>user:password@localhost</w:t>
-      </w:r>
-      <w:proofErr w:type="spellEnd"/>
-      <w:r>
-        <w:t>/</w:t>
-      </w:r>
-      <w:proofErr w:type="spellStart"/>
-      <w:r>
-        <w:t>new_db</w:t>
-      </w:r>
-      <w:proofErr w:type="spellEnd"/>
-      <w:r>
-        <w:t>"</w:t>
+    </w:p>
+    <w:p>
+      <w:r>
+        <w:t xml:space="preserve">    "customers",</w:t>
+      </w:r>
+    </w:p>
+    <w:p>
+      <w:r>
+        <w:t xml:space="preserve">    engine,</w:t>
+      </w:r>
+    </w:p>
+    <w:p>
+      <w:r>
+        <w:t xml:space="preserve">    </w:t>
+      </w:r>
+      <w:proofErr w:type="spellStart"/>
+      <w:r>
+        <w:t>if_exists</w:t>
+      </w:r>
+      <w:proofErr w:type="spellEnd"/>
+      <w:r>
+        <w:t>="append",</w:t>
+      </w:r>
+    </w:p>
+    <w:p>
+      <w:r>
+        <w:t xml:space="preserve">    index=False</w:t>
       </w:r>
     </w:p>
     <w:p>
@@ -631,70 +647,6 @@
       </w:r>
     </w:p>
     <w:p>
-      <w:pPr>
-        <w:rPr>
-          <w:b/>
-          <w:bCs/>
-        </w:rPr>
-      </w:pPr>
-      <w:r>
-        <w:rPr>
-          <w:b/>
-          <w:bCs/>
-        </w:rPr>
-        <w:t>Insert data</w:t>
-      </w:r>
-    </w:p>
-    <w:p>
-      <w:proofErr w:type="spellStart"/>
-      <w:r>
-        <w:lastRenderedPageBreak/>
-        <w:t>df_customers.to_</w:t>
-      </w:r>
-      <w:proofErr w:type="gramStart"/>
-      <w:r>
-        <w:t>sql</w:t>
-      </w:r>
-      <w:proofErr w:type="spellEnd"/>
-      <w:r>
-        <w:t>(</w:t>
-      </w:r>
-      <w:proofErr w:type="gramEnd"/>
-    </w:p>
-    <w:p>
-      <w:r>
-        <w:t xml:space="preserve">    "customers",</w:t>
-      </w:r>
-    </w:p>
-    <w:p>
-      <w:r>
-        <w:t xml:space="preserve">    engine,</w:t>
-      </w:r>
-    </w:p>
-    <w:p>
-      <w:r>
-        <w:t xml:space="preserve">    </w:t>
-      </w:r>
-      <w:proofErr w:type="spellStart"/>
-      <w:r>
-        <w:t>if_exists</w:t>
-      </w:r>
-      <w:proofErr w:type="spellEnd"/>
-      <w:r>
-        <w:t>="append",</w:t>
-      </w:r>
-    </w:p>
-    <w:p>
-      <w:r>
-        <w:t xml:space="preserve">    index=False</w:t>
-      </w:r>
-    </w:p>
-    <w:p>
-      <w:r>
-        <w:t>)</w:t>
-      </w:r>
-    </w:p>
-    <w:p>
       <w:r>
         <w:t>Repeat per table.</w:t>
       </w:r>
@@ -702,7 +654,7 @@
     <w:p>
       <w:r>
         <w:pict w14:anchorId="6A94DA7E">
-          <v:rect id="_x0000_i1089" style="width:0;height:1.5pt" o:hralign="center" o:hrstd="t" o:hr="t" fillcolor="#a0a0a0" stroked="f"/>
+          <v:rect id="_x0000_i1029" style="width:0;height:1.5pt" o:hralign="center" o:hrstd="t" o:hr="t" fillcolor="#a0a0a0" stroked="f"/>
         </w:pict>
       </w:r>
     </w:p>
@@ -805,22 +757,12 @@
         <w:t xml:space="preserve">    return </w:t>
       </w:r>
       <w:proofErr w:type="spellStart"/>
-      <w:proofErr w:type="gramStart"/>
       <w:r>
         <w:t>session.query</w:t>
       </w:r>
       <w:proofErr w:type="spellEnd"/>
-      <w:proofErr w:type="gramEnd"/>
-      <w:r>
-        <w:t>(Customer</w:t>
-      </w:r>
-      <w:proofErr w:type="gramStart"/>
-      <w:r>
-        <w:t>).filter</w:t>
-      </w:r>
-      <w:proofErr w:type="gramEnd"/>
-      <w:r>
-        <w:t>(</w:t>
+      <w:r>
+        <w:t>(Customer).filter(</w:t>
       </w:r>
       <w:proofErr w:type="spellStart"/>
       <w:r>
@@ -828,115 +770,91 @@
       </w:r>
       <w:proofErr w:type="spellEnd"/>
       <w:r>
-        <w:t xml:space="preserve"> == True</w:t>
-      </w:r>
-      <w:proofErr w:type="gramStart"/>
-      <w:r>
-        <w:t>).all</w:t>
-      </w:r>
-      <w:proofErr w:type="gramEnd"/>
+        <w:t xml:space="preserve"> == True).all()</w:t>
+      </w:r>
+    </w:p>
+    <w:p>
+      <w:r>
+        <w:pict w14:anchorId="6B8F1360">
+          <v:rect id="_x0000_i1030" style="width:0;height:1.5pt" o:hralign="center" o:hrstd="t" o:hr="t" fillcolor="#a0a0a0" stroked="f"/>
+        </w:pict>
+      </w:r>
+    </w:p>
+    <w:p>
+      <w:pPr>
+        <w:rPr>
+          <w:b/>
+          <w:bCs/>
+        </w:rPr>
+      </w:pPr>
+      <w:r>
+        <w:rPr>
+          <w:b/>
+          <w:bCs/>
+        </w:rPr>
+        <w:t>5. Use an ORM for the new system (recommended)</w:t>
+      </w:r>
+    </w:p>
+    <w:p>
+      <w:proofErr w:type="spellStart"/>
+      <w:r>
+        <w:t>SQLAlchemy</w:t>
+      </w:r>
+      <w:proofErr w:type="spellEnd"/>
+      <w:r>
+        <w:t xml:space="preserve"> example:</w:t>
+      </w:r>
+    </w:p>
+    <w:p>
+      <w:r>
+        <w:t xml:space="preserve">from </w:t>
+      </w:r>
+      <w:proofErr w:type="spellStart"/>
+      <w:r>
+        <w:t>sqlalchemy.orm</w:t>
+      </w:r>
+      <w:proofErr w:type="spellEnd"/>
+      <w:r>
+        <w:t xml:space="preserve"> import </w:t>
+      </w:r>
+      <w:proofErr w:type="spellStart"/>
+      <w:r>
+        <w:t>declarative_base</w:t>
+      </w:r>
+      <w:proofErr w:type="spellEnd"/>
+    </w:p>
+    <w:p>
+      <w:r>
+        <w:t xml:space="preserve">from </w:t>
+      </w:r>
+      <w:proofErr w:type="spellStart"/>
+      <w:r>
+        <w:t>sqlalchemy</w:t>
+      </w:r>
+      <w:proofErr w:type="spellEnd"/>
+      <w:r>
+        <w:t xml:space="preserve"> import Column, Integer, String</w:t>
+      </w:r>
+    </w:p>
+    <w:p/>
+    <w:p>
+      <w:r>
+        <w:t xml:space="preserve">Base = </w:t>
+      </w:r>
+      <w:proofErr w:type="spellStart"/>
+      <w:r>
+        <w:t>declarative_base</w:t>
+      </w:r>
+      <w:proofErr w:type="spellEnd"/>
       <w:r>
         <w:t>()</w:t>
       </w:r>
     </w:p>
-    <w:p>
-      <w:r>
-        <w:pict w14:anchorId="6B8F1360">
-          <v:rect id="_x0000_i1090" style="width:0;height:1.5pt" o:hralign="center" o:hrstd="t" o:hr="t" fillcolor="#a0a0a0" stroked="f"/>
-        </w:pict>
-      </w:r>
-    </w:p>
-    <w:p>
-      <w:pPr>
-        <w:rPr>
-          <w:b/>
-          <w:bCs/>
-        </w:rPr>
-      </w:pPr>
-      <w:r>
-        <w:rPr>
-          <w:b/>
-          <w:bCs/>
-        </w:rPr>
-        <w:t>5. Use an ORM for the new system (recommended)</w:t>
-      </w:r>
-    </w:p>
-    <w:p>
-      <w:proofErr w:type="spellStart"/>
-      <w:r>
-        <w:t>SQLAlchemy</w:t>
-      </w:r>
-      <w:proofErr w:type="spellEnd"/>
-      <w:r>
-        <w:t xml:space="preserve"> example:</w:t>
-      </w:r>
-    </w:p>
-    <w:p>
-      <w:r>
-        <w:t xml:space="preserve">from </w:t>
-      </w:r>
-      <w:proofErr w:type="spellStart"/>
-      <w:r>
-        <w:t>sqlalchemy.orm</w:t>
-      </w:r>
-      <w:proofErr w:type="spellEnd"/>
-      <w:r>
-        <w:t xml:space="preserve"> import </w:t>
-      </w:r>
-      <w:proofErr w:type="spellStart"/>
-      <w:r>
-        <w:t>declarative_base</w:t>
-      </w:r>
-      <w:proofErr w:type="spellEnd"/>
-    </w:p>
-    <w:p>
-      <w:r>
-        <w:t xml:space="preserve">from </w:t>
-      </w:r>
-      <w:proofErr w:type="spellStart"/>
-      <w:r>
-        <w:t>sqlalchemy</w:t>
-      </w:r>
-      <w:proofErr w:type="spellEnd"/>
-      <w:r>
-        <w:t xml:space="preserve"> import Column, Integer, String</w:t>
-      </w:r>
-    </w:p>
     <w:p/>
     <w:p>
       <w:r>
-        <w:t xml:space="preserve">Base = </w:t>
-      </w:r>
-      <w:proofErr w:type="spellStart"/>
-      <w:r>
-        <w:t>declarative_</w:t>
-      </w:r>
-      <w:proofErr w:type="gramStart"/>
-      <w:r>
-        <w:t>base</w:t>
-      </w:r>
-      <w:proofErr w:type="spellEnd"/>
-      <w:r>
-        <w:t>(</w:t>
-      </w:r>
-      <w:proofErr w:type="gramEnd"/>
-      <w:r>
-        <w:t>)</w:t>
-      </w:r>
-    </w:p>
-    <w:p/>
-    <w:p>
-      <w:r>
         <w:lastRenderedPageBreak/>
-        <w:t xml:space="preserve">class </w:t>
-      </w:r>
-      <w:proofErr w:type="gramStart"/>
-      <w:r>
-        <w:t>Customer(</w:t>
-      </w:r>
-      <w:proofErr w:type="gramEnd"/>
-      <w:r>
-        <w:t>Base):</w:t>
+        <w:t>class Customer(Base):</w:t>
       </w:r>
     </w:p>
     <w:p>
@@ -954,15 +872,7 @@
     </w:p>
     <w:p>
       <w:r>
-        <w:t xml:space="preserve">    id = </w:t>
-      </w:r>
-      <w:proofErr w:type="gramStart"/>
-      <w:r>
-        <w:t>Column(</w:t>
-      </w:r>
-      <w:proofErr w:type="gramEnd"/>
-      <w:r>
-        <w:t xml:space="preserve">Integer, </w:t>
+        <w:t xml:space="preserve">    id = Column(Integer, </w:t>
       </w:r>
       <w:proofErr w:type="spellStart"/>
       <w:r>
@@ -975,28 +885,12 @@
     </w:p>
     <w:p>
       <w:r>
-        <w:t xml:space="preserve">    name = </w:t>
-      </w:r>
-      <w:proofErr w:type="gramStart"/>
-      <w:r>
-        <w:t>Column(String(</w:t>
-      </w:r>
-      <w:proofErr w:type="gramEnd"/>
-      <w:r>
-        <w:t>255))</w:t>
-      </w:r>
-    </w:p>
-    <w:p>
-      <w:r>
-        <w:t xml:space="preserve">    email = </w:t>
-      </w:r>
-      <w:proofErr w:type="gramStart"/>
-      <w:r>
-        <w:t>Column(String(</w:t>
-      </w:r>
-      <w:proofErr w:type="gramEnd"/>
-      <w:r>
-        <w:t>255))</w:t>
+        <w:t xml:space="preserve">    name = Column(String(255))</w:t>
+      </w:r>
+    </w:p>
+    <w:p>
+      <w:r>
+        <w:t xml:space="preserve">    email = Column(String(255))</w:t>
       </w:r>
     </w:p>
     <w:p>
@@ -1017,7 +911,7 @@
     <w:p>
       <w:r>
         <w:pict w14:anchorId="6AE73086">
-          <v:rect id="_x0000_i1091" style="width:0;height:1.5pt" o:hralign="center" o:hrstd="t" o:hr="t" fillcolor="#a0a0a0" stroked="f"/>
+          <v:rect id="_x0000_i1031" style="width:0;height:1.5pt" o:hralign="center" o:hrstd="t" o:hr="t" fillcolor="#a0a0a0" stroked="f"/>
         </w:pict>
       </w:r>
     </w:p>
@@ -1134,7 +1028,7 @@
     <w:p>
       <w:r>
         <w:pict w14:anchorId="423D7F30">
-          <v:rect id="_x0000_i1092" style="width:0;height:1.5pt" o:hralign="center" o:hrstd="t" o:hr="t" fillcolor="#a0a0a0" stroked="f"/>
+          <v:rect id="_x0000_i1032" style="width:0;height:1.5pt" o:hralign="center" o:hrstd="t" o:hr="t" fillcolor="#a0a0a0" stroked="f"/>
         </w:pict>
       </w:r>
     </w:p>
@@ -1236,7 +1130,7 @@
     <w:p>
       <w:r>
         <w:pict w14:anchorId="4C452DAD">
-          <v:rect id="_x0000_i1093" style="width:0;height:1.5pt" o:hralign="center" o:hrstd="t" o:hr="t" fillcolor="#a0a0a0" stroked="f"/>
+          <v:rect id="_x0000_i1033" style="width:0;height:1.5pt" o:hralign="center" o:hrstd="t" o:hr="t" fillcolor="#a0a0a0" stroked="f"/>
         </w:pict>
       </w:r>
     </w:p>
@@ -1301,131 +1195,2126 @@
       </w:r>
     </w:p>
     <w:p>
-      <w:r>
-        <w:pict w14:anchorId="14F62C81">
-          <v:rect id="_x0000_i1094" style="width:0;height:1.5pt" o:hralign="center" o:hrstd="t" o:hr="t" fillcolor="#a0a0a0" stroked="f"/>
+      <w:pPr>
+        <w:spacing w:after="160" w:line="278" w:lineRule="auto"/>
+      </w:pPr>
+      <w:r>
+        <w:br w:type="page"/>
+      </w:r>
+    </w:p>
+    <w:p>
+      <w:pPr>
+        <w:rPr>
+          <w:b/>
+          <w:bCs/>
+        </w:rPr>
+      </w:pPr>
+      <w:r>
+        <w:rPr>
+          <w:b/>
+          <w:bCs/>
+        </w:rPr>
+        <w:lastRenderedPageBreak/>
+        <w:t>1. Suggested Project Structure</w:t>
+      </w:r>
+    </w:p>
+    <w:p>
+      <w:proofErr w:type="spellStart"/>
+      <w:r>
+        <w:t>kaww_hr_system</w:t>
+      </w:r>
+      <w:proofErr w:type="spellEnd"/>
+      <w:r>
+        <w:t>/</w:t>
+      </w:r>
+    </w:p>
+    <w:p>
+      <w:r>
+        <w:t>│</w:t>
+      </w:r>
+    </w:p>
+    <w:p>
+      <w:r>
+        <w:rPr>
+          <w:rFonts w:ascii="MS Gothic" w:eastAsia="MS Gothic" w:hAnsi="MS Gothic" w:cs="MS Gothic" w:hint="eastAsia"/>
+        </w:rPr>
+        <w:t>├</w:t>
+      </w:r>
+      <w:r>
+        <w:rPr>
+          <w:rFonts w:ascii="Aptos" w:hAnsi="Aptos" w:cs="Aptos"/>
+        </w:rPr>
+        <w:t>──</w:t>
+      </w:r>
+      <w:r>
+        <w:t xml:space="preserve"> </w:t>
+      </w:r>
+      <w:proofErr w:type="spellStart"/>
+      <w:r>
+        <w:t>src</w:t>
+      </w:r>
+      <w:proofErr w:type="spellEnd"/>
+      <w:r>
+        <w:t>/</w:t>
+      </w:r>
+    </w:p>
+    <w:p>
+      <w:r>
+        <w:t xml:space="preserve">│   └── </w:t>
+      </w:r>
+      <w:proofErr w:type="spellStart"/>
+      <w:r>
+        <w:t>kaww_hr_system</w:t>
+      </w:r>
+      <w:proofErr w:type="spellEnd"/>
+      <w:r>
+        <w:t>/</w:t>
+      </w:r>
+    </w:p>
+    <w:p>
+      <w:r>
+        <w:t xml:space="preserve">│       </w:t>
+      </w:r>
+      <w:r>
+        <w:rPr>
+          <w:rFonts w:ascii="MS Gothic" w:eastAsia="MS Gothic" w:hAnsi="MS Gothic" w:cs="MS Gothic" w:hint="eastAsia"/>
+        </w:rPr>
+        <w:t>├</w:t>
+      </w:r>
+      <w:r>
+        <w:rPr>
+          <w:rFonts w:ascii="Aptos" w:hAnsi="Aptos" w:cs="Aptos"/>
+        </w:rPr>
+        <w:t>──</w:t>
+      </w:r>
+      <w:r>
+        <w:t xml:space="preserve"> __init__.py</w:t>
+      </w:r>
+    </w:p>
+    <w:p>
+      <w:r>
+        <w:t xml:space="preserve">│       </w:t>
+      </w:r>
+      <w:r>
+        <w:rPr>
+          <w:rFonts w:ascii="MS Gothic" w:eastAsia="MS Gothic" w:hAnsi="MS Gothic" w:cs="MS Gothic" w:hint="eastAsia"/>
+        </w:rPr>
+        <w:t>├</w:t>
+      </w:r>
+      <w:r>
+        <w:rPr>
+          <w:rFonts w:ascii="Aptos" w:hAnsi="Aptos" w:cs="Aptos"/>
+        </w:rPr>
+        <w:t>──</w:t>
+      </w:r>
+      <w:r>
+        <w:t xml:space="preserve"> database.py         # SQL connection and schema setup</w:t>
+      </w:r>
+    </w:p>
+    <w:p>
+      <w:r>
+        <w:t xml:space="preserve">│       </w:t>
+      </w:r>
+      <w:r>
+        <w:rPr>
+          <w:rFonts w:ascii="MS Gothic" w:eastAsia="MS Gothic" w:hAnsi="MS Gothic" w:cs="MS Gothic" w:hint="eastAsia"/>
+        </w:rPr>
+        <w:t>├</w:t>
+      </w:r>
+      <w:r>
+        <w:rPr>
+          <w:rFonts w:ascii="Aptos" w:hAnsi="Aptos" w:cs="Aptos"/>
+        </w:rPr>
+        <w:t>──</w:t>
+      </w:r>
+      <w:r>
+        <w:t xml:space="preserve"> employee.py         # Employee CRUD operations</w:t>
+      </w:r>
+    </w:p>
+    <w:p>
+      <w:r>
+        <w:t xml:space="preserve">│       </w:t>
+      </w:r>
+      <w:r>
+        <w:rPr>
+          <w:rFonts w:ascii="MS Gothic" w:eastAsia="MS Gothic" w:hAnsi="MS Gothic" w:cs="MS Gothic" w:hint="eastAsia"/>
+        </w:rPr>
+        <w:t>├</w:t>
+      </w:r>
+      <w:r>
+        <w:rPr>
+          <w:rFonts w:ascii="Aptos" w:hAnsi="Aptos" w:cs="Aptos"/>
+        </w:rPr>
+        <w:t>──</w:t>
+      </w:r>
+      <w:r>
+        <w:t xml:space="preserve"> status.py           # Employee status operations</w:t>
+      </w:r>
+    </w:p>
+    <w:p>
+      <w:r>
+        <w:t xml:space="preserve">│       </w:t>
+      </w:r>
+      <w:r>
+        <w:rPr>
+          <w:rFonts w:ascii="MS Gothic" w:eastAsia="MS Gothic" w:hAnsi="MS Gothic" w:cs="MS Gothic" w:hint="eastAsia"/>
+        </w:rPr>
+        <w:t>├</w:t>
+      </w:r>
+      <w:r>
+        <w:rPr>
+          <w:rFonts w:ascii="Aptos" w:hAnsi="Aptos" w:cs="Aptos"/>
+        </w:rPr>
+        <w:t>──</w:t>
+      </w:r>
+      <w:r>
+        <w:t xml:space="preserve"> contracts.py        # Contract handling</w:t>
+      </w:r>
+    </w:p>
+    <w:p>
+      <w:r>
+        <w:t xml:space="preserve">│       </w:t>
+      </w:r>
+      <w:r>
+        <w:rPr>
+          <w:rFonts w:ascii="MS Gothic" w:eastAsia="MS Gothic" w:hAnsi="MS Gothic" w:cs="MS Gothic" w:hint="eastAsia"/>
+        </w:rPr>
+        <w:t>├</w:t>
+      </w:r>
+      <w:r>
+        <w:rPr>
+          <w:rFonts w:ascii="Aptos" w:hAnsi="Aptos" w:cs="Aptos"/>
+        </w:rPr>
+        <w:t>──</w:t>
+      </w:r>
+      <w:r>
+        <w:t xml:space="preserve"> audit.py            # Audit logging functions</w:t>
+      </w:r>
+    </w:p>
+    <w:p>
+      <w:r>
+        <w:t>│       └── utils.py            # Helper functions</w:t>
+      </w:r>
+    </w:p>
+    <w:p>
+      <w:r>
+        <w:t>│</w:t>
+      </w:r>
+    </w:p>
+    <w:p>
+      <w:r>
+        <w:rPr>
+          <w:rFonts w:ascii="MS Gothic" w:eastAsia="MS Gothic" w:hAnsi="MS Gothic" w:cs="MS Gothic" w:hint="eastAsia"/>
+        </w:rPr>
+        <w:t>├</w:t>
+      </w:r>
+      <w:r>
+        <w:rPr>
+          <w:rFonts w:ascii="Aptos" w:hAnsi="Aptos" w:cs="Aptos"/>
+        </w:rPr>
+        <w:t>──</w:t>
+      </w:r>
+      <w:r>
+        <w:t xml:space="preserve"> tests/</w:t>
+      </w:r>
+    </w:p>
+    <w:p>
+      <w:r>
+        <w:t xml:space="preserve">│   </w:t>
+      </w:r>
+      <w:r>
+        <w:rPr>
+          <w:rFonts w:ascii="MS Gothic" w:eastAsia="MS Gothic" w:hAnsi="MS Gothic" w:cs="MS Gothic" w:hint="eastAsia"/>
+        </w:rPr>
+        <w:t>├</w:t>
+      </w:r>
+      <w:r>
+        <w:rPr>
+          <w:rFonts w:ascii="Aptos" w:hAnsi="Aptos" w:cs="Aptos"/>
+        </w:rPr>
+        <w:t>──</w:t>
+      </w:r>
+      <w:r>
+        <w:t xml:space="preserve"> test_employee.py</w:t>
+      </w:r>
+    </w:p>
+    <w:p>
+      <w:r>
+        <w:t>│   └── test_status.py</w:t>
+      </w:r>
+    </w:p>
+    <w:p>
+      <w:r>
+        <w:t>│</w:t>
+      </w:r>
+    </w:p>
+    <w:p>
+      <w:r>
+        <w:rPr>
+          <w:rFonts w:ascii="MS Gothic" w:eastAsia="MS Gothic" w:hAnsi="MS Gothic" w:cs="MS Gothic" w:hint="eastAsia"/>
+        </w:rPr>
+        <w:t>├</w:t>
+      </w:r>
+      <w:r>
+        <w:rPr>
+          <w:rFonts w:ascii="Aptos" w:hAnsi="Aptos" w:cs="Aptos"/>
+        </w:rPr>
+        <w:t>──</w:t>
+      </w:r>
+      <w:r>
+        <w:t xml:space="preserve"> main.py                     # Entry point to run the program</w:t>
+      </w:r>
+    </w:p>
+    <w:p>
+      <w:r>
+        <w:rPr>
+          <w:rFonts w:ascii="MS Gothic" w:eastAsia="MS Gothic" w:hAnsi="MS Gothic" w:cs="MS Gothic" w:hint="eastAsia"/>
+        </w:rPr>
+        <w:t>├</w:t>
+      </w:r>
+      <w:r>
+        <w:rPr>
+          <w:rFonts w:ascii="Aptos" w:hAnsi="Aptos" w:cs="Aptos"/>
+        </w:rPr>
+        <w:t>──</w:t>
+      </w:r>
+      <w:r>
+        <w:t xml:space="preserve"> README.md</w:t>
+      </w:r>
+    </w:p>
+    <w:p>
+      <w:r>
+        <w:rPr>
+          <w:rFonts w:ascii="MS Gothic" w:eastAsia="MS Gothic" w:hAnsi="MS Gothic" w:cs="MS Gothic" w:hint="eastAsia"/>
+        </w:rPr>
+        <w:t>├</w:t>
+      </w:r>
+      <w:r>
+        <w:rPr>
+          <w:rFonts w:ascii="Aptos" w:hAnsi="Aptos" w:cs="Aptos"/>
+        </w:rPr>
+        <w:t>──</w:t>
+      </w:r>
+      <w:r>
+        <w:t xml:space="preserve"> requirements.txt</w:t>
+      </w:r>
+    </w:p>
+    <w:p>
+      <w:r>
+        <w:t>└── .</w:t>
+      </w:r>
+      <w:proofErr w:type="spellStart"/>
+      <w:r>
+        <w:t>gitignore</w:t>
+      </w:r>
+      <w:proofErr w:type="spellEnd"/>
+    </w:p>
+    <w:p/>
+    <w:p/>
+    <w:p/>
+    <w:p/>
+    <w:p/>
+    <w:p>
+      <w:pPr>
+        <w:rPr>
+          <w:b/>
+          <w:bCs/>
+        </w:rPr>
+      </w:pPr>
+      <w:r>
+        <w:rPr>
+          <w:b/>
+          <w:bCs/>
+        </w:rPr>
+        <w:t>2. Example: SQL Setup in Python (database.py)</w:t>
+      </w:r>
+    </w:p>
+    <w:p>
+      <w:r>
+        <w:t>import sqlite3</w:t>
+      </w:r>
+    </w:p>
+    <w:p>
+      <w:r>
+        <w:t>from sqlite3 import Connection</w:t>
+      </w:r>
+    </w:p>
+    <w:p/>
+    <w:p>
+      <w:r>
+        <w:t>DB_NAME = "</w:t>
+      </w:r>
+      <w:proofErr w:type="spellStart"/>
+      <w:r>
+        <w:t>kaww_hr.db</w:t>
+      </w:r>
+      <w:proofErr w:type="spellEnd"/>
+      <w:r>
+        <w:t>"</w:t>
+      </w:r>
+    </w:p>
+    <w:p/>
+    <w:p>
+      <w:r>
+        <w:t xml:space="preserve">def </w:t>
+      </w:r>
+      <w:proofErr w:type="spellStart"/>
+      <w:r>
+        <w:t>get_connection</w:t>
+      </w:r>
+      <w:proofErr w:type="spellEnd"/>
+      <w:r>
+        <w:t>() -&gt; Connection:</w:t>
+      </w:r>
+    </w:p>
+    <w:p>
+      <w:r>
+        <w:t xml:space="preserve">    return sqlite3.connect(DB_NAME)</w:t>
+      </w:r>
+    </w:p>
+    <w:p/>
+    <w:p>
+      <w:r>
+        <w:t xml:space="preserve">def </w:t>
+      </w:r>
+      <w:proofErr w:type="spellStart"/>
+      <w:r>
+        <w:t>initialize_database</w:t>
+      </w:r>
+      <w:proofErr w:type="spellEnd"/>
+      <w:r>
+        <w:t>():</w:t>
+      </w:r>
+    </w:p>
+    <w:p>
+      <w:r>
+        <w:t xml:space="preserve">    conn = </w:t>
+      </w:r>
+      <w:proofErr w:type="spellStart"/>
+      <w:r>
+        <w:t>get_connection</w:t>
+      </w:r>
+      <w:proofErr w:type="spellEnd"/>
+      <w:r>
+        <w:t>()</w:t>
+      </w:r>
+    </w:p>
+    <w:p>
+      <w:r>
+        <w:t xml:space="preserve">    cursor = </w:t>
+      </w:r>
+      <w:proofErr w:type="spellStart"/>
+      <w:r>
+        <w:t>conn.cursor</w:t>
+      </w:r>
+      <w:proofErr w:type="spellEnd"/>
+      <w:r>
+        <w:t>()</w:t>
+      </w:r>
+    </w:p>
+    <w:p/>
+    <w:p>
+      <w:r>
+        <w:t xml:space="preserve">    # Create Employee table</w:t>
+      </w:r>
+    </w:p>
+    <w:p>
+      <w:r>
+        <w:t xml:space="preserve">    </w:t>
+      </w:r>
+      <w:proofErr w:type="spellStart"/>
+      <w:r>
+        <w:t>cursor.execute</w:t>
+      </w:r>
+      <w:proofErr w:type="spellEnd"/>
+      <w:r>
+        <w:t>("""</w:t>
+      </w:r>
+    </w:p>
+    <w:p>
+      <w:r>
+        <w:t xml:space="preserve">    CREATE TABLE IF NOT EXISTS employee (</w:t>
+      </w:r>
+    </w:p>
+    <w:p>
+      <w:r>
+        <w:t xml:space="preserve">        </w:t>
+      </w:r>
+      <w:proofErr w:type="spellStart"/>
+      <w:r>
+        <w:t>employee_id</w:t>
+      </w:r>
+      <w:proofErr w:type="spellEnd"/>
+      <w:r>
+        <w:t xml:space="preserve"> INTEGER PRIMARY KEY AUTOINCREMENT,</w:t>
+      </w:r>
+    </w:p>
+    <w:p>
+      <w:r>
+        <w:t xml:space="preserve">        </w:t>
+      </w:r>
+      <w:proofErr w:type="spellStart"/>
+      <w:r>
+        <w:t>first_name</w:t>
+      </w:r>
+      <w:proofErr w:type="spellEnd"/>
+      <w:r>
+        <w:t xml:space="preserve"> TEXT NOT NULL,</w:t>
+      </w:r>
+    </w:p>
+    <w:p>
+      <w:r>
+        <w:t xml:space="preserve">        </w:t>
+      </w:r>
+      <w:proofErr w:type="spellStart"/>
+      <w:r>
+        <w:t>last_name</w:t>
+      </w:r>
+      <w:proofErr w:type="spellEnd"/>
+      <w:r>
+        <w:t xml:space="preserve"> TEXT NOT NULL,</w:t>
+      </w:r>
+    </w:p>
+    <w:p>
+      <w:r>
+        <w:t xml:space="preserve">        </w:t>
+      </w:r>
+      <w:proofErr w:type="spellStart"/>
+      <w:r>
+        <w:t>hire_date</w:t>
+      </w:r>
+      <w:proofErr w:type="spellEnd"/>
+      <w:r>
+        <w:t xml:space="preserve"> TEXT NOT NULL,</w:t>
+      </w:r>
+    </w:p>
+    <w:p>
+      <w:r>
+        <w:t xml:space="preserve">        </w:t>
+      </w:r>
+      <w:proofErr w:type="spellStart"/>
+      <w:r>
+        <w:t>job_title</w:t>
+      </w:r>
+      <w:proofErr w:type="spellEnd"/>
+      <w:r>
+        <w:t xml:space="preserve"> TEXT NOT NULL,</w:t>
+      </w:r>
+    </w:p>
+    <w:p>
+      <w:r>
+        <w:t xml:space="preserve">        </w:t>
+      </w:r>
+      <w:proofErr w:type="spellStart"/>
+      <w:r>
+        <w:t>status_id</w:t>
+      </w:r>
+      <w:proofErr w:type="spellEnd"/>
+      <w:r>
+        <w:t xml:space="preserve"> INTEGER,</w:t>
+      </w:r>
+    </w:p>
+    <w:p>
+      <w:r>
+        <w:t xml:space="preserve">        </w:t>
+      </w:r>
+      <w:proofErr w:type="spellStart"/>
+      <w:r>
+        <w:t>employment_type</w:t>
+      </w:r>
+      <w:proofErr w:type="spellEnd"/>
+      <w:r>
+        <w:t xml:space="preserve"> TEXT,</w:t>
+      </w:r>
+    </w:p>
+    <w:p>
+      <w:r>
+        <w:t xml:space="preserve">        </w:t>
+      </w:r>
+      <w:proofErr w:type="spellStart"/>
+      <w:r>
+        <w:t>contract_type</w:t>
+      </w:r>
+      <w:proofErr w:type="spellEnd"/>
+      <w:r>
+        <w:t xml:space="preserve"> TEXT,</w:t>
+      </w:r>
+    </w:p>
+    <w:p>
+      <w:r>
+        <w:t xml:space="preserve">        location TEXT,</w:t>
+      </w:r>
+    </w:p>
+    <w:p>
+      <w:r>
+        <w:lastRenderedPageBreak/>
+        <w:t xml:space="preserve">        FOREIGN KEY (</w:t>
+      </w:r>
+      <w:proofErr w:type="spellStart"/>
+      <w:r>
+        <w:t>status_id</w:t>
+      </w:r>
+      <w:proofErr w:type="spellEnd"/>
+      <w:r>
+        <w:t xml:space="preserve">) REFERENCES </w:t>
+      </w:r>
+      <w:proofErr w:type="spellStart"/>
+      <w:r>
+        <w:t>employee_status</w:t>
+      </w:r>
+      <w:proofErr w:type="spellEnd"/>
+      <w:r>
+        <w:t>(</w:t>
+      </w:r>
+      <w:proofErr w:type="spellStart"/>
+      <w:r>
+        <w:t>status_id</w:t>
+      </w:r>
+      <w:proofErr w:type="spellEnd"/>
+      <w:r>
+        <w:t>)</w:t>
+      </w:r>
+    </w:p>
+    <w:p>
+      <w:r>
+        <w:t xml:space="preserve">    )</w:t>
+      </w:r>
+    </w:p>
+    <w:p>
+      <w:r>
+        <w:t xml:space="preserve">    """)</w:t>
+      </w:r>
+    </w:p>
+    <w:p/>
+    <w:p>
+      <w:r>
+        <w:t xml:space="preserve">    # Create Employee Status table</w:t>
+      </w:r>
+    </w:p>
+    <w:p>
+      <w:r>
+        <w:t xml:space="preserve">    </w:t>
+      </w:r>
+      <w:proofErr w:type="spellStart"/>
+      <w:r>
+        <w:t>cursor.execute</w:t>
+      </w:r>
+      <w:proofErr w:type="spellEnd"/>
+      <w:r>
+        <w:t>("""</w:t>
+      </w:r>
+    </w:p>
+    <w:p>
+      <w:r>
+        <w:t xml:space="preserve">    CREATE TABLE IF NOT EXISTS </w:t>
+      </w:r>
+      <w:proofErr w:type="spellStart"/>
+      <w:r>
+        <w:t>employee_status</w:t>
+      </w:r>
+      <w:proofErr w:type="spellEnd"/>
+      <w:r>
+        <w:t xml:space="preserve"> (</w:t>
+      </w:r>
+    </w:p>
+    <w:p>
+      <w:r>
+        <w:t xml:space="preserve">        </w:t>
+      </w:r>
+      <w:proofErr w:type="spellStart"/>
+      <w:r>
+        <w:t>status_id</w:t>
+      </w:r>
+      <w:proofErr w:type="spellEnd"/>
+      <w:r>
+        <w:t xml:space="preserve"> INTEGER PRIMARY KEY AUTOINCREMENT,</w:t>
+      </w:r>
+    </w:p>
+    <w:p>
+      <w:r>
+        <w:t xml:space="preserve">        </w:t>
+      </w:r>
+      <w:proofErr w:type="spellStart"/>
+      <w:r>
+        <w:t>status_name</w:t>
+      </w:r>
+      <w:proofErr w:type="spellEnd"/>
+      <w:r>
+        <w:t xml:space="preserve"> TEXT NOT NULL</w:t>
+      </w:r>
+    </w:p>
+    <w:p>
+      <w:r>
+        <w:t xml:space="preserve">    )</w:t>
+      </w:r>
+    </w:p>
+    <w:p>
+      <w:r>
+        <w:t xml:space="preserve">    """)</w:t>
+      </w:r>
+    </w:p>
+    <w:p/>
+    <w:p>
+      <w:r>
+        <w:t xml:space="preserve">    # Create Audit Log table</w:t>
+      </w:r>
+    </w:p>
+    <w:p>
+      <w:r>
+        <w:t xml:space="preserve">    </w:t>
+      </w:r>
+      <w:proofErr w:type="spellStart"/>
+      <w:r>
+        <w:t>cursor.execute</w:t>
+      </w:r>
+      <w:proofErr w:type="spellEnd"/>
+      <w:r>
+        <w:t>("""</w:t>
+      </w:r>
+    </w:p>
+    <w:p>
+      <w:r>
+        <w:t xml:space="preserve">    CREATE TABLE IF NOT EXISTS </w:t>
+      </w:r>
+      <w:proofErr w:type="spellStart"/>
+      <w:r>
+        <w:t>audit_log</w:t>
+      </w:r>
+      <w:proofErr w:type="spellEnd"/>
+      <w:r>
+        <w:t xml:space="preserve"> (</w:t>
+      </w:r>
+    </w:p>
+    <w:p>
+      <w:r>
+        <w:t xml:space="preserve">        </w:t>
+      </w:r>
+      <w:proofErr w:type="spellStart"/>
+      <w:r>
+        <w:t>audit_id</w:t>
+      </w:r>
+      <w:proofErr w:type="spellEnd"/>
+      <w:r>
+        <w:t xml:space="preserve"> INTEGER PRIMARY KEY AUTOINCREMENT,</w:t>
+      </w:r>
+    </w:p>
+    <w:p>
+      <w:r>
+        <w:t xml:space="preserve">        </w:t>
+      </w:r>
+      <w:proofErr w:type="spellStart"/>
+      <w:r>
+        <w:t>table_name</w:t>
+      </w:r>
+      <w:proofErr w:type="spellEnd"/>
+      <w:r>
+        <w:t xml:space="preserve"> TEXT NOT NULL,</w:t>
+      </w:r>
+    </w:p>
+    <w:p>
+      <w:r>
+        <w:t xml:space="preserve">        </w:t>
+      </w:r>
+      <w:proofErr w:type="spellStart"/>
+      <w:r>
+        <w:t>record_id</w:t>
+      </w:r>
+      <w:proofErr w:type="spellEnd"/>
+      <w:r>
+        <w:t xml:space="preserve"> INTEGER NOT NULL,</w:t>
+      </w:r>
+    </w:p>
+    <w:p>
+      <w:r>
+        <w:t xml:space="preserve">        </w:t>
+      </w:r>
+      <w:proofErr w:type="spellStart"/>
+      <w:r>
+        <w:t>operation_type</w:t>
+      </w:r>
+      <w:proofErr w:type="spellEnd"/>
+      <w:r>
+        <w:t xml:space="preserve"> TEXT NOT NULL,</w:t>
+      </w:r>
+    </w:p>
+    <w:p>
+      <w:r>
+        <w:t xml:space="preserve">        </w:t>
+      </w:r>
+      <w:proofErr w:type="spellStart"/>
+      <w:r>
+        <w:t>change_timestamp</w:t>
+      </w:r>
+      <w:proofErr w:type="spellEnd"/>
+      <w:r>
+        <w:t xml:space="preserve"> TEXT DEFAULT CURRENT_TIMESTAMP</w:t>
+      </w:r>
+    </w:p>
+    <w:p>
+      <w:r>
+        <w:t xml:space="preserve">    )</w:t>
+      </w:r>
+    </w:p>
+    <w:p>
+      <w:r>
+        <w:t xml:space="preserve">    """)</w:t>
+      </w:r>
+    </w:p>
+    <w:p/>
+    <w:p>
+      <w:r>
+        <w:t xml:space="preserve">    </w:t>
+      </w:r>
+      <w:proofErr w:type="spellStart"/>
+      <w:r>
+        <w:t>conn.commit</w:t>
+      </w:r>
+      <w:proofErr w:type="spellEnd"/>
+      <w:r>
+        <w:t>()</w:t>
+      </w:r>
+    </w:p>
+    <w:p>
+      <w:r>
+        <w:t xml:space="preserve">    </w:t>
+      </w:r>
+      <w:proofErr w:type="spellStart"/>
+      <w:r>
+        <w:t>conn.close</w:t>
+      </w:r>
+      <w:proofErr w:type="spellEnd"/>
+      <w:r>
+        <w:t>()</w:t>
+      </w:r>
+    </w:p>
+    <w:p>
+      <w:r>
+        <w:pict w14:anchorId="2094FFC9">
+          <v:rect id="_x0000_i1086" style="width:0;height:1.5pt" o:hralign="center" o:hrstd="t" o:hr="t" fillcolor="#a0a0a0" stroked="f"/>
         </w:pict>
       </w:r>
     </w:p>
     <w:p>
-      <w:r>
-        <w:t>If you want, I can:</w:t>
+      <w:pPr>
+        <w:rPr>
+          <w:b/>
+          <w:bCs/>
+        </w:rPr>
+      </w:pPr>
+      <w:r>
+        <w:rPr>
+          <w:b/>
+          <w:bCs/>
+        </w:rPr>
+        <w:lastRenderedPageBreak/>
+        <w:t>3. Example: Employee Module (employee.py)</w:t>
+      </w:r>
+    </w:p>
+    <w:p>
+      <w:r>
+        <w:t xml:space="preserve">from .database import </w:t>
+      </w:r>
+      <w:proofErr w:type="spellStart"/>
+      <w:r>
+        <w:t>get_connection</w:t>
+      </w:r>
+      <w:proofErr w:type="spellEnd"/>
+    </w:p>
+    <w:p>
+      <w:r>
+        <w:t>from datetime import datetime</w:t>
+      </w:r>
+    </w:p>
+    <w:p>
+      <w:r>
+        <w:t xml:space="preserve">from .audit import </w:t>
+      </w:r>
+      <w:proofErr w:type="spellStart"/>
+      <w:r>
+        <w:t>log_audit</w:t>
+      </w:r>
+      <w:proofErr w:type="spellEnd"/>
+    </w:p>
+    <w:p/>
+    <w:p>
+      <w:r>
+        <w:t xml:space="preserve">def </w:t>
+      </w:r>
+      <w:proofErr w:type="spellStart"/>
+      <w:r>
+        <w:t>add_employee</w:t>
+      </w:r>
+      <w:proofErr w:type="spellEnd"/>
+      <w:r>
+        <w:t>(</w:t>
+      </w:r>
+      <w:proofErr w:type="spellStart"/>
+      <w:r>
+        <w:t>first_name</w:t>
+      </w:r>
+      <w:proofErr w:type="spellEnd"/>
+      <w:r>
+        <w:t xml:space="preserve">, </w:t>
+      </w:r>
+      <w:proofErr w:type="spellStart"/>
+      <w:r>
+        <w:t>last_name</w:t>
+      </w:r>
+      <w:proofErr w:type="spellEnd"/>
+      <w:r>
+        <w:t xml:space="preserve">, </w:t>
+      </w:r>
+      <w:proofErr w:type="spellStart"/>
+      <w:r>
+        <w:t>hire_date</w:t>
+      </w:r>
+      <w:proofErr w:type="spellEnd"/>
+      <w:r>
+        <w:t xml:space="preserve">, </w:t>
+      </w:r>
+      <w:proofErr w:type="spellStart"/>
+      <w:r>
+        <w:t>job_title</w:t>
+      </w:r>
+      <w:proofErr w:type="spellEnd"/>
+      <w:r>
+        <w:t xml:space="preserve">, </w:t>
+      </w:r>
+      <w:proofErr w:type="spellStart"/>
+      <w:r>
+        <w:t>status_id</w:t>
+      </w:r>
+      <w:proofErr w:type="spellEnd"/>
+      <w:r>
+        <w:t xml:space="preserve">=None, </w:t>
+      </w:r>
+      <w:proofErr w:type="spellStart"/>
+      <w:r>
+        <w:t>employment_type</w:t>
+      </w:r>
+      <w:proofErr w:type="spellEnd"/>
+      <w:r>
+        <w:t xml:space="preserve">=None, </w:t>
+      </w:r>
+      <w:proofErr w:type="spellStart"/>
+      <w:r>
+        <w:t>contract_type</w:t>
+      </w:r>
+      <w:proofErr w:type="spellEnd"/>
+      <w:r>
+        <w:t>=None, location=None):</w:t>
+      </w:r>
+    </w:p>
+    <w:p>
+      <w:r>
+        <w:t xml:space="preserve">    conn = </w:t>
+      </w:r>
+      <w:proofErr w:type="spellStart"/>
+      <w:r>
+        <w:t>get_connection</w:t>
+      </w:r>
+      <w:proofErr w:type="spellEnd"/>
+      <w:r>
+        <w:t>()</w:t>
+      </w:r>
+    </w:p>
+    <w:p>
+      <w:r>
+        <w:t xml:space="preserve">    cursor = </w:t>
+      </w:r>
+      <w:proofErr w:type="spellStart"/>
+      <w:r>
+        <w:t>conn.cursor</w:t>
+      </w:r>
+      <w:proofErr w:type="spellEnd"/>
+      <w:r>
+        <w:t>()</w:t>
+      </w:r>
+    </w:p>
+    <w:p/>
+    <w:p>
+      <w:r>
+        <w:t xml:space="preserve">    </w:t>
+      </w:r>
+      <w:proofErr w:type="spellStart"/>
+      <w:r>
+        <w:t>cursor.execute</w:t>
+      </w:r>
+      <w:proofErr w:type="spellEnd"/>
+      <w:r>
+        <w:t>("""</w:t>
+      </w:r>
+    </w:p>
+    <w:p>
+      <w:r>
+        <w:t xml:space="preserve">        INSERT INTO employee (</w:t>
+      </w:r>
+      <w:proofErr w:type="spellStart"/>
+      <w:r>
+        <w:t>first_name</w:t>
+      </w:r>
+      <w:proofErr w:type="spellEnd"/>
+      <w:r>
+        <w:t xml:space="preserve">, </w:t>
+      </w:r>
+      <w:proofErr w:type="spellStart"/>
+      <w:r>
+        <w:t>last_name</w:t>
+      </w:r>
+      <w:proofErr w:type="spellEnd"/>
+      <w:r>
+        <w:t xml:space="preserve">, </w:t>
+      </w:r>
+      <w:proofErr w:type="spellStart"/>
+      <w:r>
+        <w:t>hire_date</w:t>
+      </w:r>
+      <w:proofErr w:type="spellEnd"/>
+      <w:r>
+        <w:t xml:space="preserve">, </w:t>
+      </w:r>
+      <w:proofErr w:type="spellStart"/>
+      <w:r>
+        <w:t>job_title</w:t>
+      </w:r>
+      <w:proofErr w:type="spellEnd"/>
+      <w:r>
+        <w:t xml:space="preserve">, </w:t>
+      </w:r>
+      <w:proofErr w:type="spellStart"/>
+      <w:r>
+        <w:t>status_id</w:t>
+      </w:r>
+      <w:proofErr w:type="spellEnd"/>
+      <w:r>
+        <w:t xml:space="preserve">, </w:t>
+      </w:r>
+      <w:proofErr w:type="spellStart"/>
+      <w:r>
+        <w:t>employment_type</w:t>
+      </w:r>
+      <w:proofErr w:type="spellEnd"/>
+      <w:r>
+        <w:t xml:space="preserve">, </w:t>
+      </w:r>
+      <w:proofErr w:type="spellStart"/>
+      <w:r>
+        <w:t>contract_type</w:t>
+      </w:r>
+      <w:proofErr w:type="spellEnd"/>
+      <w:r>
+        <w:t>, location)</w:t>
+      </w:r>
+    </w:p>
+    <w:p>
+      <w:r>
+        <w:t xml:space="preserve">        VALUES (?, ?, ?, ?, ?, ?, ?, ?)</w:t>
+      </w:r>
+    </w:p>
+    <w:p>
+      <w:r>
+        <w:t xml:space="preserve">    """, (</w:t>
+      </w:r>
+      <w:proofErr w:type="spellStart"/>
+      <w:r>
+        <w:t>first_name</w:t>
+      </w:r>
+      <w:proofErr w:type="spellEnd"/>
+      <w:r>
+        <w:t xml:space="preserve">, </w:t>
+      </w:r>
+      <w:proofErr w:type="spellStart"/>
+      <w:r>
+        <w:t>last_name</w:t>
+      </w:r>
+      <w:proofErr w:type="spellEnd"/>
+      <w:r>
+        <w:t xml:space="preserve">, </w:t>
+      </w:r>
+      <w:proofErr w:type="spellStart"/>
+      <w:r>
+        <w:t>hire_date</w:t>
+      </w:r>
+      <w:proofErr w:type="spellEnd"/>
+      <w:r>
+        <w:t xml:space="preserve">, </w:t>
+      </w:r>
+      <w:proofErr w:type="spellStart"/>
+      <w:r>
+        <w:t>job_title</w:t>
+      </w:r>
+      <w:proofErr w:type="spellEnd"/>
+      <w:r>
+        <w:t xml:space="preserve">, </w:t>
+      </w:r>
+      <w:proofErr w:type="spellStart"/>
+      <w:r>
+        <w:t>status_id</w:t>
+      </w:r>
+      <w:proofErr w:type="spellEnd"/>
+      <w:r>
+        <w:t xml:space="preserve">, </w:t>
+      </w:r>
+      <w:proofErr w:type="spellStart"/>
+      <w:r>
+        <w:t>employment_type</w:t>
+      </w:r>
+      <w:proofErr w:type="spellEnd"/>
+      <w:r>
+        <w:t xml:space="preserve">, </w:t>
+      </w:r>
+      <w:proofErr w:type="spellStart"/>
+      <w:r>
+        <w:t>contract_type</w:t>
+      </w:r>
+      <w:proofErr w:type="spellEnd"/>
+      <w:r>
+        <w:t>, location))</w:t>
+      </w:r>
+    </w:p>
+    <w:p/>
+    <w:p>
+      <w:r>
+        <w:t xml:space="preserve">    </w:t>
+      </w:r>
+      <w:proofErr w:type="spellStart"/>
+      <w:r>
+        <w:t>employee_id</w:t>
+      </w:r>
+      <w:proofErr w:type="spellEnd"/>
+      <w:r>
+        <w:t xml:space="preserve"> = </w:t>
+      </w:r>
+      <w:proofErr w:type="spellStart"/>
+      <w:r>
+        <w:t>cursor.lastrowid</w:t>
+      </w:r>
+      <w:proofErr w:type="spellEnd"/>
+    </w:p>
+    <w:p>
+      <w:r>
+        <w:t xml:space="preserve">    </w:t>
+      </w:r>
+      <w:proofErr w:type="spellStart"/>
+      <w:r>
+        <w:t>conn.commit</w:t>
+      </w:r>
+      <w:proofErr w:type="spellEnd"/>
+      <w:r>
+        <w:t>()</w:t>
+      </w:r>
+    </w:p>
+    <w:p>
+      <w:r>
+        <w:t xml:space="preserve">    </w:t>
+      </w:r>
+      <w:proofErr w:type="spellStart"/>
+      <w:r>
+        <w:t>conn.close</w:t>
+      </w:r>
+      <w:proofErr w:type="spellEnd"/>
+      <w:r>
+        <w:t>()</w:t>
+      </w:r>
+    </w:p>
+    <w:p/>
+    <w:p>
+      <w:r>
+        <w:t xml:space="preserve">    # Log creation in audit</w:t>
+      </w:r>
+    </w:p>
+    <w:p>
+      <w:r>
+        <w:t xml:space="preserve">    </w:t>
+      </w:r>
+      <w:proofErr w:type="spellStart"/>
+      <w:r>
+        <w:t>log_audit</w:t>
+      </w:r>
+      <w:proofErr w:type="spellEnd"/>
+      <w:r>
+        <w:t xml:space="preserve">("employee", </w:t>
+      </w:r>
+      <w:proofErr w:type="spellStart"/>
+      <w:r>
+        <w:t>employee_id</w:t>
+      </w:r>
+      <w:proofErr w:type="spellEnd"/>
+      <w:r>
+        <w:t>, "INSERT")</w:t>
+      </w:r>
+    </w:p>
+    <w:p>
+      <w:r>
+        <w:t xml:space="preserve">    return </w:t>
+      </w:r>
+      <w:proofErr w:type="spellStart"/>
+      <w:r>
+        <w:t>employee_id</w:t>
+      </w:r>
+      <w:proofErr w:type="spellEnd"/>
+    </w:p>
+    <w:p/>
+    <w:p>
+      <w:r>
+        <w:t xml:space="preserve">def </w:t>
+      </w:r>
+      <w:proofErr w:type="spellStart"/>
+      <w:r>
+        <w:t>get_employee</w:t>
+      </w:r>
+      <w:proofErr w:type="spellEnd"/>
+      <w:r>
+        <w:t>(</w:t>
+      </w:r>
+      <w:proofErr w:type="spellStart"/>
+      <w:r>
+        <w:t>employee_id</w:t>
+      </w:r>
+      <w:proofErr w:type="spellEnd"/>
+      <w:r>
+        <w:t>):</w:t>
+      </w:r>
+    </w:p>
+    <w:p>
+      <w:r>
+        <w:t xml:space="preserve">    conn = </w:t>
+      </w:r>
+      <w:proofErr w:type="spellStart"/>
+      <w:r>
+        <w:t>get_connection</w:t>
+      </w:r>
+      <w:proofErr w:type="spellEnd"/>
+      <w:r>
+        <w:t>()</w:t>
+      </w:r>
+    </w:p>
+    <w:p>
+      <w:r>
+        <w:lastRenderedPageBreak/>
+        <w:t xml:space="preserve">    cursor = </w:t>
+      </w:r>
+      <w:proofErr w:type="spellStart"/>
+      <w:r>
+        <w:t>conn.cursor</w:t>
+      </w:r>
+      <w:proofErr w:type="spellEnd"/>
+      <w:r>
+        <w:t>()</w:t>
+      </w:r>
+    </w:p>
+    <w:p>
+      <w:r>
+        <w:t xml:space="preserve">    </w:t>
+      </w:r>
+      <w:proofErr w:type="spellStart"/>
+      <w:r>
+        <w:t>cursor.execute</w:t>
+      </w:r>
+      <w:proofErr w:type="spellEnd"/>
+      <w:r>
+        <w:t xml:space="preserve">("SELECT * FROM employee WHERE </w:t>
+      </w:r>
+      <w:proofErr w:type="spellStart"/>
+      <w:r>
+        <w:t>employee_id</w:t>
+      </w:r>
+      <w:proofErr w:type="spellEnd"/>
+      <w:r>
+        <w:t xml:space="preserve"> = ?", (</w:t>
+      </w:r>
+      <w:proofErr w:type="spellStart"/>
+      <w:r>
+        <w:t>employee_id</w:t>
+      </w:r>
+      <w:proofErr w:type="spellEnd"/>
+      <w:r>
+        <w:t>,))</w:t>
+      </w:r>
+    </w:p>
+    <w:p>
+      <w:r>
+        <w:t xml:space="preserve">    employee = </w:t>
+      </w:r>
+      <w:proofErr w:type="spellStart"/>
+      <w:r>
+        <w:t>cursor.fetchone</w:t>
+      </w:r>
+      <w:proofErr w:type="spellEnd"/>
+      <w:r>
+        <w:t>()</w:t>
+      </w:r>
+    </w:p>
+    <w:p>
+      <w:r>
+        <w:t xml:space="preserve">    </w:t>
+      </w:r>
+      <w:proofErr w:type="spellStart"/>
+      <w:r>
+        <w:t>conn.close</w:t>
+      </w:r>
+      <w:proofErr w:type="spellEnd"/>
+      <w:r>
+        <w:t>()</w:t>
+      </w:r>
+    </w:p>
+    <w:p>
+      <w:r>
+        <w:t xml:space="preserve">    return employee</w:t>
+      </w:r>
+    </w:p>
+    <w:p>
+      <w:r>
+        <w:pict w14:anchorId="0F257F8A">
+          <v:rect id="_x0000_i1087" style="width:0;height:1.5pt" o:hralign="center" o:hrstd="t" o:hr="t" fillcolor="#a0a0a0" stroked="f"/>
+        </w:pict>
+      </w:r>
+    </w:p>
+    <w:p>
+      <w:pPr>
+        <w:rPr>
+          <w:b/>
+          <w:bCs/>
+        </w:rPr>
+      </w:pPr>
+      <w:r>
+        <w:rPr>
+          <w:b/>
+          <w:bCs/>
+        </w:rPr>
+        <w:t>4. Example: Audit Logging (audit.py)</w:t>
+      </w:r>
+    </w:p>
+    <w:p>
+      <w:r>
+        <w:t xml:space="preserve">from .database import </w:t>
+      </w:r>
+      <w:proofErr w:type="spellStart"/>
+      <w:r>
+        <w:t>get_connection</w:t>
+      </w:r>
+      <w:proofErr w:type="spellEnd"/>
+    </w:p>
+    <w:p>
+      <w:r>
+        <w:t>from datetime import datetime</w:t>
+      </w:r>
+    </w:p>
+    <w:p/>
+    <w:p>
+      <w:r>
+        <w:t xml:space="preserve">def </w:t>
+      </w:r>
+      <w:proofErr w:type="spellStart"/>
+      <w:r>
+        <w:t>log_audit</w:t>
+      </w:r>
+      <w:proofErr w:type="spellEnd"/>
+      <w:r>
+        <w:t>(</w:t>
+      </w:r>
+      <w:proofErr w:type="spellStart"/>
+      <w:r>
+        <w:t>table_name</w:t>
+      </w:r>
+      <w:proofErr w:type="spellEnd"/>
+      <w:r>
+        <w:t xml:space="preserve">, </w:t>
+      </w:r>
+      <w:proofErr w:type="spellStart"/>
+      <w:r>
+        <w:t>record_id</w:t>
+      </w:r>
+      <w:proofErr w:type="spellEnd"/>
+      <w:r>
+        <w:t xml:space="preserve">, </w:t>
+      </w:r>
+      <w:proofErr w:type="spellStart"/>
+      <w:r>
+        <w:t>operation_type</w:t>
+      </w:r>
+      <w:proofErr w:type="spellEnd"/>
+      <w:r>
+        <w:t>):</w:t>
+      </w:r>
+    </w:p>
+    <w:p>
+      <w:r>
+        <w:t xml:space="preserve">    conn = </w:t>
+      </w:r>
+      <w:proofErr w:type="spellStart"/>
+      <w:r>
+        <w:t>get_connection</w:t>
+      </w:r>
+      <w:proofErr w:type="spellEnd"/>
+      <w:r>
+        <w:t>()</w:t>
+      </w:r>
+    </w:p>
+    <w:p>
+      <w:r>
+        <w:t xml:space="preserve">    cursor = </w:t>
+      </w:r>
+      <w:proofErr w:type="spellStart"/>
+      <w:r>
+        <w:t>conn.cursor</w:t>
+      </w:r>
+      <w:proofErr w:type="spellEnd"/>
+      <w:r>
+        <w:t>()</w:t>
+      </w:r>
+    </w:p>
+    <w:p>
+      <w:r>
+        <w:t xml:space="preserve">    </w:t>
+      </w:r>
+      <w:proofErr w:type="spellStart"/>
+      <w:r>
+        <w:t>cursor.execute</w:t>
+      </w:r>
+      <w:proofErr w:type="spellEnd"/>
+      <w:r>
+        <w:t>("""</w:t>
+      </w:r>
+    </w:p>
+    <w:p>
+      <w:r>
+        <w:t xml:space="preserve">        INSERT INTO </w:t>
+      </w:r>
+      <w:proofErr w:type="spellStart"/>
+      <w:r>
+        <w:t>audit_log</w:t>
+      </w:r>
+      <w:proofErr w:type="spellEnd"/>
+      <w:r>
+        <w:t xml:space="preserve"> (</w:t>
+      </w:r>
+      <w:proofErr w:type="spellStart"/>
+      <w:r>
+        <w:t>table_name</w:t>
+      </w:r>
+      <w:proofErr w:type="spellEnd"/>
+      <w:r>
+        <w:t xml:space="preserve">, </w:t>
+      </w:r>
+      <w:proofErr w:type="spellStart"/>
+      <w:r>
+        <w:t>record_id</w:t>
+      </w:r>
+      <w:proofErr w:type="spellEnd"/>
+      <w:r>
+        <w:t xml:space="preserve">, </w:t>
+      </w:r>
+      <w:proofErr w:type="spellStart"/>
+      <w:r>
+        <w:t>operation_type</w:t>
+      </w:r>
+      <w:proofErr w:type="spellEnd"/>
+      <w:r>
+        <w:t>)</w:t>
+      </w:r>
+    </w:p>
+    <w:p>
+      <w:r>
+        <w:t xml:space="preserve">        VALUES (?, ?, ?)</w:t>
+      </w:r>
+    </w:p>
+    <w:p>
+      <w:r>
+        <w:t xml:space="preserve">    """, (</w:t>
+      </w:r>
+      <w:proofErr w:type="spellStart"/>
+      <w:r>
+        <w:t>table_name</w:t>
+      </w:r>
+      <w:proofErr w:type="spellEnd"/>
+      <w:r>
+        <w:t xml:space="preserve">, </w:t>
+      </w:r>
+      <w:proofErr w:type="spellStart"/>
+      <w:r>
+        <w:t>record_id</w:t>
+      </w:r>
+      <w:proofErr w:type="spellEnd"/>
+      <w:r>
+        <w:t xml:space="preserve">, </w:t>
+      </w:r>
+      <w:proofErr w:type="spellStart"/>
+      <w:r>
+        <w:t>operation_type</w:t>
+      </w:r>
+      <w:proofErr w:type="spellEnd"/>
+      <w:r>
+        <w:t>))</w:t>
+      </w:r>
+    </w:p>
+    <w:p>
+      <w:r>
+        <w:t xml:space="preserve">    </w:t>
+      </w:r>
+      <w:proofErr w:type="spellStart"/>
+      <w:r>
+        <w:t>conn.commit</w:t>
+      </w:r>
+      <w:proofErr w:type="spellEnd"/>
+      <w:r>
+        <w:t>()</w:t>
+      </w:r>
+    </w:p>
+    <w:p>
+      <w:r>
+        <w:t xml:space="preserve">    </w:t>
+      </w:r>
+      <w:proofErr w:type="spellStart"/>
+      <w:r>
+        <w:t>conn.close</w:t>
+      </w:r>
+      <w:proofErr w:type="spellEnd"/>
+      <w:r>
+        <w:t>()</w:t>
+      </w:r>
+    </w:p>
+    <w:p>
+      <w:r>
+        <w:pict w14:anchorId="2C9A897B">
+          <v:rect id="_x0000_i1088" style="width:0;height:1.5pt" o:hralign="center" o:hrstd="t" o:hr="t" fillcolor="#a0a0a0" stroked="f"/>
+        </w:pict>
+      </w:r>
+    </w:p>
+    <w:p>
+      <w:pPr>
+        <w:rPr>
+          <w:b/>
+          <w:bCs/>
+        </w:rPr>
+      </w:pPr>
+      <w:r>
+        <w:rPr>
+          <w:b/>
+          <w:bCs/>
+        </w:rPr>
+        <w:t>5. Example: Main Program (main.py)</w:t>
+      </w:r>
+    </w:p>
+    <w:p>
+      <w:r>
+        <w:t xml:space="preserve">from </w:t>
+      </w:r>
+      <w:proofErr w:type="spellStart"/>
+      <w:r>
+        <w:t>src.kaww_hr_system.database</w:t>
+      </w:r>
+      <w:proofErr w:type="spellEnd"/>
+      <w:r>
+        <w:t xml:space="preserve"> import </w:t>
+      </w:r>
+      <w:proofErr w:type="spellStart"/>
+      <w:r>
+        <w:t>initialize_database</w:t>
+      </w:r>
+      <w:proofErr w:type="spellEnd"/>
+    </w:p>
+    <w:p>
+      <w:r>
+        <w:t xml:space="preserve">from </w:t>
+      </w:r>
+      <w:proofErr w:type="spellStart"/>
+      <w:r>
+        <w:t>src.kaww_hr_system.employee</w:t>
+      </w:r>
+      <w:proofErr w:type="spellEnd"/>
+      <w:r>
+        <w:t xml:space="preserve"> import </w:t>
+      </w:r>
+      <w:proofErr w:type="spellStart"/>
+      <w:r>
+        <w:t>add_employee</w:t>
+      </w:r>
+      <w:proofErr w:type="spellEnd"/>
+      <w:r>
+        <w:t xml:space="preserve">, </w:t>
+      </w:r>
+      <w:proofErr w:type="spellStart"/>
+      <w:r>
+        <w:t>get_employee</w:t>
+      </w:r>
+      <w:proofErr w:type="spellEnd"/>
+    </w:p>
+    <w:p/>
+    <w:p>
+      <w:r>
+        <w:t>def main():</w:t>
+      </w:r>
+    </w:p>
+    <w:p>
+      <w:r>
+        <w:t xml:space="preserve">    # Initialize database and tables</w:t>
+      </w:r>
+    </w:p>
+    <w:p>
+      <w:r>
+        <w:lastRenderedPageBreak/>
+        <w:t xml:space="preserve">    </w:t>
+      </w:r>
+      <w:proofErr w:type="spellStart"/>
+      <w:r>
+        <w:t>initialize_database</w:t>
+      </w:r>
+      <w:proofErr w:type="spellEnd"/>
+      <w:r>
+        <w:t>()</w:t>
+      </w:r>
+    </w:p>
+    <w:p/>
+    <w:p>
+      <w:r>
+        <w:t xml:space="preserve">    # Add a new employee</w:t>
+      </w:r>
+    </w:p>
+    <w:p>
+      <w:r>
+        <w:t xml:space="preserve">    </w:t>
+      </w:r>
+      <w:proofErr w:type="spellStart"/>
+      <w:r>
+        <w:t>emp_id</w:t>
+      </w:r>
+      <w:proofErr w:type="spellEnd"/>
+      <w:r>
+        <w:t xml:space="preserve"> = </w:t>
+      </w:r>
+      <w:proofErr w:type="spellStart"/>
+      <w:r>
+        <w:t>add_employee</w:t>
+      </w:r>
+      <w:proofErr w:type="spellEnd"/>
+      <w:r>
+        <w:t>(</w:t>
+      </w:r>
+    </w:p>
+    <w:p>
+      <w:r>
+        <w:t xml:space="preserve">        </w:t>
+      </w:r>
+      <w:proofErr w:type="spellStart"/>
+      <w:r>
+        <w:t>first_name</w:t>
+      </w:r>
+      <w:proofErr w:type="spellEnd"/>
+      <w:r>
+        <w:t>="Alice",</w:t>
+      </w:r>
+    </w:p>
+    <w:p>
+      <w:r>
+        <w:t xml:space="preserve">        </w:t>
+      </w:r>
+      <w:proofErr w:type="spellStart"/>
+      <w:r>
+        <w:t>last_name</w:t>
+      </w:r>
+      <w:proofErr w:type="spellEnd"/>
+      <w:r>
+        <w:t>="Smith",</w:t>
+      </w:r>
+    </w:p>
+    <w:p>
+      <w:r>
+        <w:t xml:space="preserve">        </w:t>
+      </w:r>
+      <w:proofErr w:type="spellStart"/>
+      <w:r>
+        <w:t>hire_date</w:t>
+      </w:r>
+      <w:proofErr w:type="spellEnd"/>
+      <w:r>
+        <w:t>="2026-01-13",</w:t>
+      </w:r>
+    </w:p>
+    <w:p>
+      <w:r>
+        <w:t xml:space="preserve">        </w:t>
+      </w:r>
+      <w:proofErr w:type="spellStart"/>
+      <w:r>
+        <w:t>job_title</w:t>
+      </w:r>
+      <w:proofErr w:type="spellEnd"/>
+      <w:r>
+        <w:t>="Software Engineer",</w:t>
+      </w:r>
+    </w:p>
+    <w:p>
+      <w:r>
+        <w:t xml:space="preserve">        </w:t>
+      </w:r>
+      <w:proofErr w:type="spellStart"/>
+      <w:r>
+        <w:t>status_id</w:t>
+      </w:r>
+      <w:proofErr w:type="spellEnd"/>
+      <w:r>
+        <w:t>=1,</w:t>
+      </w:r>
+    </w:p>
+    <w:p>
+      <w:r>
+        <w:t xml:space="preserve">        </w:t>
+      </w:r>
+      <w:proofErr w:type="spellStart"/>
+      <w:r>
+        <w:t>employment_type</w:t>
+      </w:r>
+      <w:proofErr w:type="spellEnd"/>
+      <w:r>
+        <w:t>="Permanent",</w:t>
+      </w:r>
+    </w:p>
+    <w:p>
+      <w:r>
+        <w:t xml:space="preserve">        </w:t>
+      </w:r>
+      <w:proofErr w:type="spellStart"/>
+      <w:r>
+        <w:t>contract_type</w:t>
+      </w:r>
+      <w:proofErr w:type="spellEnd"/>
+      <w:r>
+        <w:t>="N/A",</w:t>
+      </w:r>
+    </w:p>
+    <w:p>
+      <w:r>
+        <w:t xml:space="preserve">        location="Head Office"</w:t>
+      </w:r>
+    </w:p>
+    <w:p>
+      <w:r>
+        <w:t xml:space="preserve">    )</w:t>
+      </w:r>
+    </w:p>
+    <w:p>
+      <w:r>
+        <w:t xml:space="preserve">    print(</w:t>
+      </w:r>
+      <w:proofErr w:type="spellStart"/>
+      <w:r>
+        <w:t>f"Added</w:t>
+      </w:r>
+      <w:proofErr w:type="spellEnd"/>
+      <w:r>
+        <w:t xml:space="preserve"> employee with ID {</w:t>
+      </w:r>
+      <w:proofErr w:type="spellStart"/>
+      <w:r>
+        <w:t>emp_id</w:t>
+      </w:r>
+      <w:proofErr w:type="spellEnd"/>
+      <w:r>
+        <w:t>}")</w:t>
+      </w:r>
+    </w:p>
+    <w:p/>
+    <w:p>
+      <w:r>
+        <w:t xml:space="preserve">    # Retrieve employee</w:t>
+      </w:r>
+    </w:p>
+    <w:p>
+      <w:r>
+        <w:t xml:space="preserve">    employee = </w:t>
+      </w:r>
+      <w:proofErr w:type="spellStart"/>
+      <w:r>
+        <w:t>get_employee</w:t>
+      </w:r>
+      <w:proofErr w:type="spellEnd"/>
+      <w:r>
+        <w:t>(</w:t>
+      </w:r>
+      <w:proofErr w:type="spellStart"/>
+      <w:r>
+        <w:t>emp_id</w:t>
+      </w:r>
+      <w:proofErr w:type="spellEnd"/>
+      <w:r>
+        <w:t>)</w:t>
+      </w:r>
+    </w:p>
+    <w:p>
+      <w:r>
+        <w:t xml:space="preserve">    print("Employee record:", employee)</w:t>
+      </w:r>
+    </w:p>
+    <w:p/>
+    <w:p>
+      <w:r>
+        <w:t>if __name__ == "__main__":</w:t>
+      </w:r>
+    </w:p>
+    <w:p>
+      <w:r>
+        <w:t xml:space="preserve">    main()</w:t>
+      </w:r>
+    </w:p>
+    <w:p>
+      <w:r>
+        <w:pict w14:anchorId="3F98FDF0">
+          <v:rect id="_x0000_i1089" style="width:0;height:1.5pt" o:hralign="center" o:hrstd="t" o:hr="t" fillcolor="#a0a0a0" stroked="f"/>
+        </w:pict>
+      </w:r>
+    </w:p>
+    <w:p>
+      <w:pPr>
+        <w:rPr>
+          <w:b/>
+          <w:bCs/>
+        </w:rPr>
+      </w:pPr>
+      <w:r>
+        <w:rPr>
+          <w:b/>
+          <w:bCs/>
+        </w:rPr>
+        <w:t>6. Recommended Folder Conventions</w:t>
       </w:r>
     </w:p>
     <w:p>
       <w:pPr>
         <w:numPr>
           <w:ilvl w:val="0"/>
-          <w:numId w:val="9"/>
+          <w:numId w:val="11"/>
         </w:numPr>
       </w:pPr>
-      <w:r>
-        <w:t xml:space="preserve">Help you </w:t>
-      </w:r>
-      <w:r>
-        <w:rPr>
-          <w:b/>
-          <w:bCs/>
-        </w:rPr>
-        <w:t>design the new schema</w:t>
+      <w:proofErr w:type="spellStart"/>
+      <w:r>
+        <w:t>src</w:t>
+      </w:r>
+      <w:proofErr w:type="spellEnd"/>
+      <w:r>
+        <w:t>/</w:t>
+      </w:r>
+      <w:proofErr w:type="spellStart"/>
+      <w:r>
+        <w:t>kaww_hr_system</w:t>
+      </w:r>
+      <w:proofErr w:type="spellEnd"/>
+      <w:r>
+        <w:t>/ → all Python modules</w:t>
       </w:r>
     </w:p>
     <w:p>
       <w:pPr>
         <w:numPr>
           <w:ilvl w:val="0"/>
-          <w:numId w:val="9"/>
+          <w:numId w:val="11"/>
         </w:numPr>
       </w:pPr>
       <w:r>
-        <w:t xml:space="preserve">Write a </w:t>
-      </w:r>
-      <w:r>
-        <w:rPr>
-          <w:b/>
-          <w:bCs/>
-        </w:rPr>
-        <w:t>full one-time migration script</w:t>
+        <w:t xml:space="preserve">tests/ → unit tests for modules (use </w:t>
+      </w:r>
+      <w:proofErr w:type="spellStart"/>
+      <w:r>
+        <w:t>pytest</w:t>
+      </w:r>
+      <w:proofErr w:type="spellEnd"/>
+      <w:r>
+        <w:t>)</w:t>
       </w:r>
     </w:p>
     <w:p>
       <w:pPr>
         <w:numPr>
           <w:ilvl w:val="0"/>
-          <w:numId w:val="9"/>
+          <w:numId w:val="11"/>
         </w:numPr>
       </w:pPr>
       <w:r>
-        <w:t xml:space="preserve">Suggest a </w:t>
-      </w:r>
-      <w:r>
-        <w:rPr>
-          <w:b/>
-          <w:bCs/>
-        </w:rPr>
-        <w:t>Python app structure</w:t>
-      </w:r>
-      <w:r>
-        <w:t xml:space="preserve"> (CLI, API, desktop)</w:t>
+        <w:t>images/ → optional if you need assets (like logos)</w:t>
       </w:r>
     </w:p>
     <w:p>
       <w:pPr>
         <w:numPr>
           <w:ilvl w:val="0"/>
-          <w:numId w:val="9"/>
+          <w:numId w:val="11"/>
         </w:numPr>
       </w:pPr>
       <w:r>
-        <w:t xml:space="preserve">Advise on </w:t>
-      </w:r>
-      <w:r>
-        <w:rPr>
-          <w:b/>
-          <w:bCs/>
-        </w:rPr>
-        <w:t>MySQL vs PostgreSQL</w:t>
-      </w:r>
-      <w:r>
-        <w:t xml:space="preserve"> for your use case</w:t>
-      </w:r>
-    </w:p>
-    <w:p>
-      <w:r>
-        <w:t>Tell me:</w:t>
+        <w:lastRenderedPageBreak/>
+        <w:t xml:space="preserve">requirements.txt → list Python packages: e.g., sqlite3 is built-in, but if you use </w:t>
+      </w:r>
+      <w:proofErr w:type="spellStart"/>
+      <w:r>
+        <w:t>SQLAlchemy</w:t>
+      </w:r>
+      <w:proofErr w:type="spellEnd"/>
+      <w:r>
+        <w:t xml:space="preserve"> or pandas add them</w:t>
+      </w:r>
+    </w:p>
+    <w:p>
+      <w:r>
+        <w:pict w14:anchorId="6B52BA40">
+          <v:rect id="_x0000_i1090" style="width:0;height:1.5pt" o:hralign="center" o:hrstd="t" o:hr="t" fillcolor="#a0a0a0" stroked="f"/>
+        </w:pict>
+      </w:r>
+    </w:p>
+    <w:p>
+      <w:pPr>
+        <w:rPr>
+          <w:b/>
+          <w:bCs/>
+        </w:rPr>
+      </w:pPr>
+      <w:r>
+        <w:rPr>
+          <w:rFonts w:ascii="Segoe UI Emoji" w:hAnsi="Segoe UI Emoji" w:cs="Segoe UI Emoji"/>
+          <w:b/>
+          <w:bCs/>
+        </w:rPr>
+        <w:t>✅</w:t>
+      </w:r>
+      <w:r>
+        <w:rPr>
+          <w:b/>
+          <w:bCs/>
+        </w:rPr>
+        <w:t xml:space="preserve"> Benefits of This Structure</w:t>
       </w:r>
     </w:p>
     <w:p>
       <w:pPr>
         <w:numPr>
           <w:ilvl w:val="0"/>
-          <w:numId w:val="10"/>
+          <w:numId w:val="12"/>
         </w:numPr>
       </w:pPr>
       <w:r>
-        <w:t>Approximate size of the database</w:t>
+        <w:rPr>
+          <w:b/>
+          <w:bCs/>
+        </w:rPr>
+        <w:t>Scalable:</w:t>
+      </w:r>
+      <w:r>
+        <w:t xml:space="preserve"> Can add modules like contracts.py, position_history.py, acting_positions.py.</w:t>
       </w:r>
     </w:p>
     <w:p>
       <w:pPr>
         <w:numPr>
           <w:ilvl w:val="0"/>
-          <w:numId w:val="10"/>
+          <w:numId w:val="12"/>
         </w:numPr>
       </w:pPr>
       <w:r>
-        <w:t>Whether this will be single-user or multi-user</w:t>
+        <w:rPr>
+          <w:b/>
+          <w:bCs/>
+        </w:rPr>
+        <w:t>Auditable:</w:t>
+      </w:r>
+      <w:r>
+        <w:t xml:space="preserve"> Every change logs into </w:t>
+      </w:r>
+      <w:proofErr w:type="spellStart"/>
+      <w:r>
+        <w:t>audit_log</w:t>
+      </w:r>
+      <w:proofErr w:type="spellEnd"/>
+      <w:r>
+        <w:t>.</w:t>
       </w:r>
     </w:p>
     <w:p>
       <w:pPr>
         <w:numPr>
           <w:ilvl w:val="0"/>
-          <w:numId w:val="10"/>
+          <w:numId w:val="12"/>
         </w:numPr>
       </w:pPr>
       <w:r>
-        <w:t>Whether you plan to build a UI or API on top</w:t>
+        <w:rPr>
+          <w:b/>
+          <w:bCs/>
+        </w:rPr>
+        <w:t>Organized:</w:t>
+      </w:r>
+      <w:r>
+        <w:t xml:space="preserve"> Separates </w:t>
+      </w:r>
+      <w:r>
+        <w:rPr>
+          <w:b/>
+          <w:bCs/>
+        </w:rPr>
+        <w:t>database logic</w:t>
+      </w:r>
+      <w:r>
+        <w:t xml:space="preserve">, </w:t>
+      </w:r>
+      <w:r>
+        <w:rPr>
+          <w:b/>
+          <w:bCs/>
+        </w:rPr>
+        <w:t>business logic</w:t>
+      </w:r>
+      <w:r>
+        <w:t xml:space="preserve">, and </w:t>
+      </w:r>
+      <w:r>
+        <w:rPr>
+          <w:b/>
+          <w:bCs/>
+        </w:rPr>
+        <w:t>utility functions</w:t>
+      </w:r>
+      <w:r>
+        <w:t>.</w:t>
+      </w:r>
+    </w:p>
+    <w:p>
+      <w:pPr>
+        <w:numPr>
+          <w:ilvl w:val="0"/>
+          <w:numId w:val="12"/>
+        </w:numPr>
+      </w:pPr>
+      <w:r>
+        <w:rPr>
+          <w:b/>
+          <w:bCs/>
+        </w:rPr>
+        <w:t>Testable:</w:t>
+      </w:r>
+      <w:r>
+        <w:t xml:space="preserve"> tests/ folder can hold unit tests for HR operations.</w:t>
+      </w:r>
+    </w:p>
+    <w:p>
+      <w:pPr>
+        <w:numPr>
+          <w:ilvl w:val="0"/>
+          <w:numId w:val="12"/>
+        </w:numPr>
+      </w:pPr>
+      <w:r>
+        <w:rPr>
+          <w:b/>
+          <w:bCs/>
+        </w:rPr>
+        <w:t>Brandable:</w:t>
+      </w:r>
+      <w:r>
+        <w:t xml:space="preserve"> Everything is under </w:t>
+      </w:r>
+      <w:proofErr w:type="spellStart"/>
+      <w:r>
+        <w:t>kaww_hr_system</w:t>
+      </w:r>
+      <w:proofErr w:type="spellEnd"/>
+      <w:r>
+        <w:t>.</w:t>
+      </w:r>
+    </w:p>
+    <w:p>
+      <w:r>
+        <w:pict w14:anchorId="5FC00FD3">
+          <v:rect id="_x0000_i1091" style="width:0;height:1.5pt" o:hralign="center" o:hrstd="t" o:hr="t" fillcolor="#a0a0a0" stroked="f"/>
+        </w:pict>
+      </w:r>
+    </w:p>
+    <w:p>
+      <w:r>
+        <w:t xml:space="preserve">If you want, I can </w:t>
+      </w:r>
+      <w:r>
+        <w:rPr>
+          <w:b/>
+          <w:bCs/>
+        </w:rPr>
+        <w:t>expand this example to include:</w:t>
+      </w:r>
+    </w:p>
+    <w:p>
+      <w:pPr>
+        <w:numPr>
+          <w:ilvl w:val="0"/>
+          <w:numId w:val="13"/>
+        </w:numPr>
+      </w:pPr>
+      <w:proofErr w:type="spellStart"/>
+      <w:r>
+        <w:t>employee_status</w:t>
+      </w:r>
+      <w:proofErr w:type="spellEnd"/>
+      <w:r>
+        <w:t xml:space="preserve"> operations</w:t>
+      </w:r>
+    </w:p>
+    <w:p>
+      <w:pPr>
+        <w:numPr>
+          <w:ilvl w:val="0"/>
+          <w:numId w:val="13"/>
+        </w:numPr>
+      </w:pPr>
+      <w:r>
+        <w:t>contracts table and module</w:t>
+      </w:r>
+    </w:p>
+    <w:p>
+      <w:pPr>
+        <w:numPr>
+          <w:ilvl w:val="0"/>
+          <w:numId w:val="13"/>
+        </w:numPr>
+      </w:pPr>
+      <w:r>
+        <w:t>acting positions and position history</w:t>
+      </w:r>
+    </w:p>
+    <w:p>
+      <w:pPr>
+        <w:numPr>
+          <w:ilvl w:val="0"/>
+          <w:numId w:val="13"/>
+        </w:numPr>
+      </w:pPr>
+      <w:r>
+        <w:t xml:space="preserve">Complete </w:t>
+      </w:r>
+      <w:r>
+        <w:rPr>
+          <w:b/>
+          <w:bCs/>
+        </w:rPr>
+        <w:t>auditing of all changes</w:t>
+      </w:r>
+      <w:r>
+        <w:t>, including acting roles</w:t>
+      </w:r>
+    </w:p>
+    <w:p>
+      <w:r>
+        <w:t xml:space="preserve">This would essentially </w:t>
+      </w:r>
+      <w:r>
+        <w:rPr>
+          <w:b/>
+          <w:bCs/>
+        </w:rPr>
+        <w:t>implement your full HR/audit ERD in Python + SQL</w:t>
+      </w:r>
+      <w:r>
+        <w:t>.</w:t>
+      </w:r>
+    </w:p>
+    <w:p>
+      <w:r>
+        <w:t>Do you want me to do that next?</w:t>
       </w:r>
     </w:p>
     <w:p/>
@@ -2485,6 +4374,155 @@
     </w:lvl>
   </w:abstractNum>
   <w:abstractNum w:abstractNumId="7" w15:restartNumberingAfterBreak="0">
+    <w:nsid w:val="4DEB003A"/>
+    <w:multiLevelType w:val="multilevel"/>
+    <w:tmpl w:val="ABBAAB2E"/>
+    <w:lvl w:ilvl="0">
+      <w:start w:val="1"/>
+      <w:numFmt w:val="bullet"/>
+      <w:lvlText w:val=""/>
+      <w:lvlJc w:val="left"/>
+      <w:pPr>
+        <w:tabs>
+          <w:tab w:val="num" w:pos="720"/>
+        </w:tabs>
+        <w:ind w:left="720" w:hanging="360"/>
+      </w:pPr>
+      <w:rPr>
+        <w:rFonts w:ascii="Symbol" w:hAnsi="Symbol" w:hint="default"/>
+        <w:sz w:val="20"/>
+      </w:rPr>
+    </w:lvl>
+    <w:lvl w:ilvl="1" w:tentative="1">
+      <w:start w:val="1"/>
+      <w:numFmt w:val="bullet"/>
+      <w:lvlText w:val="o"/>
+      <w:lvlJc w:val="left"/>
+      <w:pPr>
+        <w:tabs>
+          <w:tab w:val="num" w:pos="1440"/>
+        </w:tabs>
+        <w:ind w:left="1440" w:hanging="360"/>
+      </w:pPr>
+      <w:rPr>
+        <w:rFonts w:ascii="Courier New" w:hAnsi="Courier New" w:hint="default"/>
+        <w:sz w:val="20"/>
+      </w:rPr>
+    </w:lvl>
+    <w:lvl w:ilvl="2" w:tentative="1">
+      <w:start w:val="1"/>
+      <w:numFmt w:val="bullet"/>
+      <w:lvlText w:val=""/>
+      <w:lvlJc w:val="left"/>
+      <w:pPr>
+        <w:tabs>
+          <w:tab w:val="num" w:pos="2160"/>
+        </w:tabs>
+        <w:ind w:left="2160" w:hanging="360"/>
+      </w:pPr>
+      <w:rPr>
+        <w:rFonts w:ascii="Wingdings" w:hAnsi="Wingdings" w:hint="default"/>
+        <w:sz w:val="20"/>
+      </w:rPr>
+    </w:lvl>
+    <w:lvl w:ilvl="3" w:tentative="1">
+      <w:start w:val="1"/>
+      <w:numFmt w:val="bullet"/>
+      <w:lvlText w:val=""/>
+      <w:lvlJc w:val="left"/>
+      <w:pPr>
+        <w:tabs>
+          <w:tab w:val="num" w:pos="2880"/>
+        </w:tabs>
+        <w:ind w:left="2880" w:hanging="360"/>
+      </w:pPr>
+      <w:rPr>
+        <w:rFonts w:ascii="Wingdings" w:hAnsi="Wingdings" w:hint="default"/>
+        <w:sz w:val="20"/>
+      </w:rPr>
+    </w:lvl>
+    <w:lvl w:ilvl="4" w:tentative="1">
+      <w:start w:val="1"/>
+      <w:numFmt w:val="bullet"/>
+      <w:lvlText w:val=""/>
+      <w:lvlJc w:val="left"/>
+      <w:pPr>
+        <w:tabs>
+          <w:tab w:val="num" w:pos="3600"/>
+        </w:tabs>
+        <w:ind w:left="3600" w:hanging="360"/>
+      </w:pPr>
+      <w:rPr>
+        <w:rFonts w:ascii="Wingdings" w:hAnsi="Wingdings" w:hint="default"/>
+        <w:sz w:val="20"/>
+      </w:rPr>
+    </w:lvl>
+    <w:lvl w:ilvl="5" w:tentative="1">
+      <w:start w:val="1"/>
+      <w:numFmt w:val="bullet"/>
+      <w:lvlText w:val=""/>
+      <w:lvlJc w:val="left"/>
+      <w:pPr>
+        <w:tabs>
+          <w:tab w:val="num" w:pos="4320"/>
+        </w:tabs>
+        <w:ind w:left="4320" w:hanging="360"/>
+      </w:pPr>
+      <w:rPr>
+        <w:rFonts w:ascii="Wingdings" w:hAnsi="Wingdings" w:hint="default"/>
+        <w:sz w:val="20"/>
+      </w:rPr>
+    </w:lvl>
+    <w:lvl w:ilvl="6" w:tentative="1">
+      <w:start w:val="1"/>
+      <w:numFmt w:val="bullet"/>
+      <w:lvlText w:val=""/>
+      <w:lvlJc w:val="left"/>
+      <w:pPr>
+        <w:tabs>
+          <w:tab w:val="num" w:pos="5040"/>
+        </w:tabs>
+        <w:ind w:left="5040" w:hanging="360"/>
+      </w:pPr>
+      <w:rPr>
+        <w:rFonts w:ascii="Wingdings" w:hAnsi="Wingdings" w:hint="default"/>
+        <w:sz w:val="20"/>
+      </w:rPr>
+    </w:lvl>
+    <w:lvl w:ilvl="7" w:tentative="1">
+      <w:start w:val="1"/>
+      <w:numFmt w:val="bullet"/>
+      <w:lvlText w:val=""/>
+      <w:lvlJc w:val="left"/>
+      <w:pPr>
+        <w:tabs>
+          <w:tab w:val="num" w:pos="5760"/>
+        </w:tabs>
+        <w:ind w:left="5760" w:hanging="360"/>
+      </w:pPr>
+      <w:rPr>
+        <w:rFonts w:ascii="Wingdings" w:hAnsi="Wingdings" w:hint="default"/>
+        <w:sz w:val="20"/>
+      </w:rPr>
+    </w:lvl>
+    <w:lvl w:ilvl="8" w:tentative="1">
+      <w:start w:val="1"/>
+      <w:numFmt w:val="bullet"/>
+      <w:lvlText w:val=""/>
+      <w:lvlJc w:val="left"/>
+      <w:pPr>
+        <w:tabs>
+          <w:tab w:val="num" w:pos="6480"/>
+        </w:tabs>
+        <w:ind w:left="6480" w:hanging="360"/>
+      </w:pPr>
+      <w:rPr>
+        <w:rFonts w:ascii="Wingdings" w:hAnsi="Wingdings" w:hint="default"/>
+        <w:sz w:val="20"/>
+      </w:rPr>
+    </w:lvl>
+  </w:abstractNum>
+  <w:abstractNum w:abstractNumId="8" w15:restartNumberingAfterBreak="0">
     <w:nsid w:val="59351145"/>
     <w:multiLevelType w:val="multilevel"/>
     <w:tmpl w:val="5014A290"/>
@@ -2633,7 +4671,156 @@
       </w:rPr>
     </w:lvl>
   </w:abstractNum>
-  <w:abstractNum w:abstractNumId="8" w15:restartNumberingAfterBreak="0">
+  <w:abstractNum w:abstractNumId="9" w15:restartNumberingAfterBreak="0">
+    <w:nsid w:val="5EAC2817"/>
+    <w:multiLevelType w:val="multilevel"/>
+    <w:tmpl w:val="6698540C"/>
+    <w:lvl w:ilvl="0">
+      <w:start w:val="1"/>
+      <w:numFmt w:val="bullet"/>
+      <w:lvlText w:val=""/>
+      <w:lvlJc w:val="left"/>
+      <w:pPr>
+        <w:tabs>
+          <w:tab w:val="num" w:pos="720"/>
+        </w:tabs>
+        <w:ind w:left="720" w:hanging="360"/>
+      </w:pPr>
+      <w:rPr>
+        <w:rFonts w:ascii="Symbol" w:hAnsi="Symbol" w:hint="default"/>
+        <w:sz w:val="20"/>
+      </w:rPr>
+    </w:lvl>
+    <w:lvl w:ilvl="1" w:tentative="1">
+      <w:start w:val="1"/>
+      <w:numFmt w:val="bullet"/>
+      <w:lvlText w:val="o"/>
+      <w:lvlJc w:val="left"/>
+      <w:pPr>
+        <w:tabs>
+          <w:tab w:val="num" w:pos="1440"/>
+        </w:tabs>
+        <w:ind w:left="1440" w:hanging="360"/>
+      </w:pPr>
+      <w:rPr>
+        <w:rFonts w:ascii="Courier New" w:hAnsi="Courier New" w:hint="default"/>
+        <w:sz w:val="20"/>
+      </w:rPr>
+    </w:lvl>
+    <w:lvl w:ilvl="2" w:tentative="1">
+      <w:start w:val="1"/>
+      <w:numFmt w:val="bullet"/>
+      <w:lvlText w:val=""/>
+      <w:lvlJc w:val="left"/>
+      <w:pPr>
+        <w:tabs>
+          <w:tab w:val="num" w:pos="2160"/>
+        </w:tabs>
+        <w:ind w:left="2160" w:hanging="360"/>
+      </w:pPr>
+      <w:rPr>
+        <w:rFonts w:ascii="Wingdings" w:hAnsi="Wingdings" w:hint="default"/>
+        <w:sz w:val="20"/>
+      </w:rPr>
+    </w:lvl>
+    <w:lvl w:ilvl="3" w:tentative="1">
+      <w:start w:val="1"/>
+      <w:numFmt w:val="bullet"/>
+      <w:lvlText w:val=""/>
+      <w:lvlJc w:val="left"/>
+      <w:pPr>
+        <w:tabs>
+          <w:tab w:val="num" w:pos="2880"/>
+        </w:tabs>
+        <w:ind w:left="2880" w:hanging="360"/>
+      </w:pPr>
+      <w:rPr>
+        <w:rFonts w:ascii="Wingdings" w:hAnsi="Wingdings" w:hint="default"/>
+        <w:sz w:val="20"/>
+      </w:rPr>
+    </w:lvl>
+    <w:lvl w:ilvl="4" w:tentative="1">
+      <w:start w:val="1"/>
+      <w:numFmt w:val="bullet"/>
+      <w:lvlText w:val=""/>
+      <w:lvlJc w:val="left"/>
+      <w:pPr>
+        <w:tabs>
+          <w:tab w:val="num" w:pos="3600"/>
+        </w:tabs>
+        <w:ind w:left="3600" w:hanging="360"/>
+      </w:pPr>
+      <w:rPr>
+        <w:rFonts w:ascii="Wingdings" w:hAnsi="Wingdings" w:hint="default"/>
+        <w:sz w:val="20"/>
+      </w:rPr>
+    </w:lvl>
+    <w:lvl w:ilvl="5" w:tentative="1">
+      <w:start w:val="1"/>
+      <w:numFmt w:val="bullet"/>
+      <w:lvlText w:val=""/>
+      <w:lvlJc w:val="left"/>
+      <w:pPr>
+        <w:tabs>
+          <w:tab w:val="num" w:pos="4320"/>
+        </w:tabs>
+        <w:ind w:left="4320" w:hanging="360"/>
+      </w:pPr>
+      <w:rPr>
+        <w:rFonts w:ascii="Wingdings" w:hAnsi="Wingdings" w:hint="default"/>
+        <w:sz w:val="20"/>
+      </w:rPr>
+    </w:lvl>
+    <w:lvl w:ilvl="6" w:tentative="1">
+      <w:start w:val="1"/>
+      <w:numFmt w:val="bullet"/>
+      <w:lvlText w:val=""/>
+      <w:lvlJc w:val="left"/>
+      <w:pPr>
+        <w:tabs>
+          <w:tab w:val="num" w:pos="5040"/>
+        </w:tabs>
+        <w:ind w:left="5040" w:hanging="360"/>
+      </w:pPr>
+      <w:rPr>
+        <w:rFonts w:ascii="Wingdings" w:hAnsi="Wingdings" w:hint="default"/>
+        <w:sz w:val="20"/>
+      </w:rPr>
+    </w:lvl>
+    <w:lvl w:ilvl="7" w:tentative="1">
+      <w:start w:val="1"/>
+      <w:numFmt w:val="bullet"/>
+      <w:lvlText w:val=""/>
+      <w:lvlJc w:val="left"/>
+      <w:pPr>
+        <w:tabs>
+          <w:tab w:val="num" w:pos="5760"/>
+        </w:tabs>
+        <w:ind w:left="5760" w:hanging="360"/>
+      </w:pPr>
+      <w:rPr>
+        <w:rFonts w:ascii="Wingdings" w:hAnsi="Wingdings" w:hint="default"/>
+        <w:sz w:val="20"/>
+      </w:rPr>
+    </w:lvl>
+    <w:lvl w:ilvl="8" w:tentative="1">
+      <w:start w:val="1"/>
+      <w:numFmt w:val="bullet"/>
+      <w:lvlText w:val=""/>
+      <w:lvlJc w:val="left"/>
+      <w:pPr>
+        <w:tabs>
+          <w:tab w:val="num" w:pos="6480"/>
+        </w:tabs>
+        <w:ind w:left="6480" w:hanging="360"/>
+      </w:pPr>
+      <w:rPr>
+        <w:rFonts w:ascii="Wingdings" w:hAnsi="Wingdings" w:hint="default"/>
+        <w:sz w:val="20"/>
+      </w:rPr>
+    </w:lvl>
+  </w:abstractNum>
+  <w:abstractNum w:abstractNumId="10" w15:restartNumberingAfterBreak="0">
     <w:nsid w:val="62A92A80"/>
     <w:multiLevelType w:val="multilevel"/>
     <w:tmpl w:val="4EEC1092"/>
@@ -2782,7 +4969,7 @@
       </w:rPr>
     </w:lvl>
   </w:abstractNum>
-  <w:abstractNum w:abstractNumId="9" w15:restartNumberingAfterBreak="0">
+  <w:abstractNum w:abstractNumId="11" w15:restartNumberingAfterBreak="0">
     <w:nsid w:val="6E5A539C"/>
     <w:multiLevelType w:val="multilevel"/>
     <w:tmpl w:val="938845E0"/>
@@ -2929,6 +5116,119 @@
         <w:rFonts w:ascii="Wingdings" w:hAnsi="Wingdings" w:hint="default"/>
         <w:sz w:val="20"/>
       </w:rPr>
+    </w:lvl>
+  </w:abstractNum>
+  <w:abstractNum w:abstractNumId="12" w15:restartNumberingAfterBreak="0">
+    <w:nsid w:val="76DF0DFA"/>
+    <w:multiLevelType w:val="multilevel"/>
+    <w:tmpl w:val="D7709302"/>
+    <w:lvl w:ilvl="0">
+      <w:start w:val="1"/>
+      <w:numFmt w:val="decimal"/>
+      <w:lvlText w:val="%1."/>
+      <w:lvlJc w:val="left"/>
+      <w:pPr>
+        <w:tabs>
+          <w:tab w:val="num" w:pos="720"/>
+        </w:tabs>
+        <w:ind w:left="720" w:hanging="360"/>
+      </w:pPr>
+    </w:lvl>
+    <w:lvl w:ilvl="1" w:tentative="1">
+      <w:start w:val="1"/>
+      <w:numFmt w:val="decimal"/>
+      <w:lvlText w:val="%2."/>
+      <w:lvlJc w:val="left"/>
+      <w:pPr>
+        <w:tabs>
+          <w:tab w:val="num" w:pos="1440"/>
+        </w:tabs>
+        <w:ind w:left="1440" w:hanging="360"/>
+      </w:pPr>
+    </w:lvl>
+    <w:lvl w:ilvl="2" w:tentative="1">
+      <w:start w:val="1"/>
+      <w:numFmt w:val="decimal"/>
+      <w:lvlText w:val="%3."/>
+      <w:lvlJc w:val="left"/>
+      <w:pPr>
+        <w:tabs>
+          <w:tab w:val="num" w:pos="2160"/>
+        </w:tabs>
+        <w:ind w:left="2160" w:hanging="360"/>
+      </w:pPr>
+    </w:lvl>
+    <w:lvl w:ilvl="3" w:tentative="1">
+      <w:start w:val="1"/>
+      <w:numFmt w:val="decimal"/>
+      <w:lvlText w:val="%4."/>
+      <w:lvlJc w:val="left"/>
+      <w:pPr>
+        <w:tabs>
+          <w:tab w:val="num" w:pos="2880"/>
+        </w:tabs>
+        <w:ind w:left="2880" w:hanging="360"/>
+      </w:pPr>
+    </w:lvl>
+    <w:lvl w:ilvl="4" w:tentative="1">
+      <w:start w:val="1"/>
+      <w:numFmt w:val="decimal"/>
+      <w:lvlText w:val="%5."/>
+      <w:lvlJc w:val="left"/>
+      <w:pPr>
+        <w:tabs>
+          <w:tab w:val="num" w:pos="3600"/>
+        </w:tabs>
+        <w:ind w:left="3600" w:hanging="360"/>
+      </w:pPr>
+    </w:lvl>
+    <w:lvl w:ilvl="5" w:tentative="1">
+      <w:start w:val="1"/>
+      <w:numFmt w:val="decimal"/>
+      <w:lvlText w:val="%6."/>
+      <w:lvlJc w:val="left"/>
+      <w:pPr>
+        <w:tabs>
+          <w:tab w:val="num" w:pos="4320"/>
+        </w:tabs>
+        <w:ind w:left="4320" w:hanging="360"/>
+      </w:pPr>
+    </w:lvl>
+    <w:lvl w:ilvl="6" w:tentative="1">
+      <w:start w:val="1"/>
+      <w:numFmt w:val="decimal"/>
+      <w:lvlText w:val="%7."/>
+      <w:lvlJc w:val="left"/>
+      <w:pPr>
+        <w:tabs>
+          <w:tab w:val="num" w:pos="5040"/>
+        </w:tabs>
+        <w:ind w:left="5040" w:hanging="360"/>
+      </w:pPr>
+    </w:lvl>
+    <w:lvl w:ilvl="7" w:tentative="1">
+      <w:start w:val="1"/>
+      <w:numFmt w:val="decimal"/>
+      <w:lvlText w:val="%8."/>
+      <w:lvlJc w:val="left"/>
+      <w:pPr>
+        <w:tabs>
+          <w:tab w:val="num" w:pos="5760"/>
+        </w:tabs>
+        <w:ind w:left="5760" w:hanging="360"/>
+      </w:pPr>
+    </w:lvl>
+    <w:lvl w:ilvl="8" w:tentative="1">
+      <w:start w:val="1"/>
+      <w:numFmt w:val="decimal"/>
+      <w:lvlText w:val="%9."/>
+      <w:lvlJc w:val="left"/>
+      <w:pPr>
+        <w:tabs>
+          <w:tab w:val="num" w:pos="6480"/>
+        </w:tabs>
+        <w:ind w:left="6480" w:hanging="360"/>
+      </w:pPr>
     </w:lvl>
   </w:abstractNum>
   <w:num w:numId="1" w16cid:durableId="1524784481">
@@ -2938,7 +5238,7 @@
     <w:abstractNumId w:val="1"/>
   </w:num>
   <w:num w:numId="3" w16cid:durableId="108814730">
-    <w:abstractNumId w:val="9"/>
+    <w:abstractNumId w:val="11"/>
   </w:num>
   <w:num w:numId="4" w16cid:durableId="72091348">
     <w:abstractNumId w:val="5"/>
@@ -2947,19 +5247,28 @@
     <w:abstractNumId w:val="4"/>
   </w:num>
   <w:num w:numId="6" w16cid:durableId="176433338">
-    <w:abstractNumId w:val="7"/>
+    <w:abstractNumId w:val="8"/>
   </w:num>
   <w:num w:numId="7" w16cid:durableId="2115972634">
     <w:abstractNumId w:val="3"/>
   </w:num>
   <w:num w:numId="8" w16cid:durableId="438181849">
-    <w:abstractNumId w:val="8"/>
+    <w:abstractNumId w:val="10"/>
   </w:num>
   <w:num w:numId="9" w16cid:durableId="1952855840">
     <w:abstractNumId w:val="0"/>
   </w:num>
   <w:num w:numId="10" w16cid:durableId="695815303">
     <w:abstractNumId w:val="2"/>
+  </w:num>
+  <w:num w:numId="11" w16cid:durableId="1713923571">
+    <w:abstractNumId w:val="9"/>
+  </w:num>
+  <w:num w:numId="12" w16cid:durableId="773744585">
+    <w:abstractNumId w:val="12"/>
+  </w:num>
+  <w:num w:numId="13" w16cid:durableId="1009212562">
+    <w:abstractNumId w:val="7"/>
   </w:num>
 </w:numbering>
 </file>

</xml_diff>